<commit_message>
Dissertatsiya: 80 ta xom LaTeX bo'lagi → satr-ichi Word native OMML
- scripts/omml_inline.py: inline LaTeX→OMML konvertor (indeks, yunon, \text/\mathrm/\texttt, \bar, \mathbb)
- para()/lead()/bullets() emit_rich() ishlatadi; **qalin** saqlanadi
- xom $...$ 80 → 0; OMML tenglama 13 → 93; matnda teskari chiziq yo'q
- Tekshirildi: pandoc docx→latex to'g'ri o'qidi

Co-Authored-By: Claude Fable 5 <noreply@anthropic.com>
Claude-Session: https://claude.ai/code/session_019HhRdzBFhtfZkYUpfZ6mRq
</commit_message>
<xml_diff>
--- a/MAMOGRAF_PhD_dissertatsiya.docx
+++ b/MAMOGRAF_PhD_dissertatsiya.docx
@@ -1575,6 +1575,10 @@
         <w:t xml:space="preserve">Dissertatsiya mavzusining dolzarbligi va zarurati. </w:t>
       </w:r>
       <w:r>
+        <w:rPr>
+          <w:b w:val="0"/>
+          <w:i w:val="0"/>
+        </w:rPr>
         <w:t>Jahonda ko'krak saratoni ayollar o'rtasida eng ko'p uchraydigan onkologik kasallik bo'lib, onkologik o'limning yetakchi sabablaridan biridir. Jahon sog'liqni saqlash tashkiloti (JSST) va Globocan ma'lumotlariga ko'ra, har yili dunyo bo'ylab millionlab yangi holatlar qayd etilib, yuz minglab ayol bu kasallikdan vafot etadi. Kasallikni erta, simptomsiz bosqichida aniqlash besh yillik yashash ko'rsatkichini sezilarli oshiradi va davolash imkoniyatlarini kengaytiradi. Erta aniqlashning eng samarali vositasi — skrining mammografiyasidir. Biroq mammografiya tasvirlarini qo'lda talqin qilish radiologning malakasiga bog'liq bo'lib, kuzatuvchilararo va kuzatuvchi ichidagi o'zgaruvchanlik, ish hajmining kattaligi natijasidagi charchoq hamda dastlabki bosqich shikastlanishlarning nozik tabiati kabi obyektiv cheklovlarga duch keladi. Ushbu cheklovlar soxta-musbat va soxta-manfiy tashxislarga olib kelishi mumkin. Shu bois, mammografiya tasvirlarini sun'iy intellekt yordamida avtomatik tahlil qiluvchi, radiolog qaroriga yordam beruvchi (computer-aided diagnosis, CAD) tizimlarni yaratish dolzarb ilmiy-amaliy masala hisoblanadi.</w:t>
       </w:r>
     </w:p>
@@ -1629,6 +1633,10 @@
         <w:t xml:space="preserve">Tadqiqotning respublika fan va texnologiyalari rivojlanishining ustuvor yo'nalishlariga bog'liqligi. </w:t>
       </w:r>
       <w:r>
+        <w:rPr>
+          <w:b w:val="0"/>
+          <w:i w:val="0"/>
+        </w:rPr>
         <w:t>O'zbekiston Respublikasida onkologik kasalliklarni erta aniqlash va o'lim ko'rsatkichini kamaytirish davlat siyosatining ustuvor yo'nalishlaridan biri hisoblanadi. «O'zbekiston-2030» strategiyasi hamda O'zbekiston Respublikasi Prezidentining «Raqamli O'zbekiston-2030» strategiyasini tasdiqlash to'g'risidagi Farmonida raqamli texnologiyalar va sun'iy intellektni sog'liqni saqlash tizimiga keng joriy etish, tibbiy tasvirlar tahliliga asoslangan tashxis tizimlarini ishlab chiqish vazifalari belgilangan. Ushbu dissertatsiya tadqiqoti mazkur hujjatlarda qo'yilgan vazifalarni amalga oshirishga xizmat qiladi.</w:t>
       </w:r>
     </w:p>
@@ -1644,6 +1652,10 @@
         <w:t xml:space="preserve">Muammoning o'rganilganlik darajasi. </w:t>
       </w:r>
       <w:r>
+        <w:rPr>
+          <w:b w:val="0"/>
+          <w:i w:val="0"/>
+        </w:rPr>
         <w:t>Mammografik shikastlanishlarni aniqlashda zamonaviy chuqur o'rganish modellari — bir bosqichli (YOLO, SSD, RetinaNet) va ikki bosqichli (Faster R-CNN) detektorlar — keng qo'llanilmoqda. O'zaro e'tibor (attention) mexanizmlari ko'p modalli birlashtirishda samarali ekanligi ko'rsatilgan. Radiomika yo'nalishi tasvirdan miqdoriy belgilarni chiqarib, izohlanuvchanlikni oshirishga imkon beradi. Biroq ko'pko'rinishli, ikki tomonlama va ordinal induktiv taxminlarni yagona tarmoqda birlashtirgan, hamda topilmalardan avtomatik klinik xulosa shakllantirishni qo'llab-quvvatlovchi yaxlit yechim yetarlicha o'rganilmagan. Bu bo'shliq tadqiqotning ilmiy muammosini belgilaydi.</w:t>
       </w:r>
     </w:p>
@@ -1659,6 +1671,10 @@
         <w:t xml:space="preserve">Tadqiqotning maqsadi — </w:t>
       </w:r>
       <w:r>
+        <w:rPr>
+          <w:b w:val="0"/>
+          <w:i w:val="0"/>
+        </w:rPr>
         <w:t>mammografiya tasvirlarida ko'krak o'sma sohalarini ikki tomonlama asimmetriya va ko'rinishlararo muvofiqlikni hisobga olgan holda aniqlash, BI-RADS bo'yicha ordinal tasniflash hamda topilmalardan avtomatik klinik xulosa shakllantirishning sun'iy intellektga asoslangan algoritm va dasturiy majmuasini ishlab chiqishdan iborat.</w:t>
       </w:r>
     </w:p>
@@ -1668,22 +1684,10 @@
       </w:pPr>
       <w:r>
         <w:rPr>
-          <w:b w:val="0"/>
-          <w:i w:val="0"/>
-        </w:rPr>
-      </w:r>
-      <w:r>
-        <w:rPr>
           <w:b/>
           <w:i w:val="0"/>
         </w:rPr>
         <w:t>Tadqiqotning vazifalari:</w:t>
-      </w:r>
-      <w:r>
-        <w:rPr>
-          <w:b w:val="0"/>
-          <w:i w:val="0"/>
-        </w:rPr>
       </w:r>
     </w:p>
     <w:p>
@@ -1694,6 +1698,7 @@
       <w:r>
         <w:rPr>
           <w:b w:val="0"/>
+          <w:i w:val="0"/>
         </w:rPr>
         <w:t>mammografiya tasvirlarini tahlil qilishning zamonaviy holatini, mavjud usul va algoritmlarni tahlil qilish hamda ularning cheklovlarini aniqlash;</w:t>
       </w:r>
@@ -1706,6 +1711,7 @@
       <w:r>
         <w:rPr>
           <w:b w:val="0"/>
+          <w:i w:val="0"/>
         </w:rPr>
         <w:t>kontralateral asimmetriyani hisobga oluvchi ikki tomonlama o'zaro e'tibor (BCA) blokini ishlab chiqish va uning gradiyent xossalarini tahlil qilish;</w:t>
       </w:r>
@@ -1718,6 +1724,7 @@
       <w:r>
         <w:rPr>
           <w:b w:val="0"/>
+          <w:i w:val="0"/>
         </w:rPr>
         <w:t>CC va MLO ko'rinishlari o'rtasida obyektlik muvofiqligini ta'minlovchi ko'rinishlararo muvofiqlik (IVC) modulini taklif etish;</w:t>
       </w:r>
@@ -1730,6 +1737,7 @@
       <w:r>
         <w:rPr>
           <w:b w:val="0"/>
+          <w:i w:val="0"/>
         </w:rPr>
         <w:t>BI-RADS kategoriyasini ordinal regressiya (monoton ostonalar bilan kumulyativ bog'lanish) orqali baholash algoritmini ishlab chiqish;</w:t>
       </w:r>
@@ -1742,6 +1750,7 @@
       <w:r>
         <w:rPr>
           <w:b w:val="0"/>
+          <w:i w:val="0"/>
         </w:rPr>
         <w:t>radiomik belgilarni chuqur o'rganish tasvirlovchilari bilan birlashtiruvchi gibrid usulni qo'llash;</w:t>
       </w:r>
@@ -1754,6 +1763,7 @@
       <w:r>
         <w:rPr>
           <w:b w:val="0"/>
+          <w:i w:val="0"/>
         </w:rPr>
         <w:t>annotatsiya, faol o'rganish, AI yordami va GPU'da model o'qitishni qo'llab-quvvatlovchi dasturiy majmuani loyihalash va amalga oshirish;</w:t>
       </w:r>
@@ -1766,6 +1776,7 @@
       <w:r>
         <w:rPr>
           <w:b w:val="0"/>
+          <w:i w:val="0"/>
         </w:rPr>
         <w:t>topilmalardan grounded (faqat aniqlangan ma'lumotga asoslangan) avtomatik klinik xulosa shakllantirish va uni DICOM SR sifatida eksport qilish modulini ishlab chiqish;</w:t>
       </w:r>
@@ -1778,6 +1789,7 @@
       <w:r>
         <w:rPr>
           <w:b w:val="0"/>
+          <w:i w:val="0"/>
         </w:rPr>
         <w:t>taklif etilgan algoritm va dasturiy majmuani tajribaviy baholash hamda amaliyotda qo'llash.</w:t>
       </w:r>
@@ -1794,6 +1806,10 @@
         <w:t xml:space="preserve">Tadqiqotning obyekti — </w:t>
       </w:r>
       <w:r>
+        <w:rPr>
+          <w:b w:val="0"/>
+          <w:i w:val="0"/>
+        </w:rPr>
         <w:t>rentgen nurlari asosida turli proyeksiyalarda (CC, MLO) olingan raqamli mammografiya tasvirlari (DICOM formati) va ularga tegishli klinik hisobotlar, jumladan Respublika ixtisoslashtirilgan Onkologiya va Radiologiya ilmiy-amaliy tibbiy markazidan olingan (anonimlashtirilgan) klinik mammografiya ma'lumotlari hamda ochiq VinDr-Mammo to'plami.</w:t>
       </w:r>
     </w:p>
@@ -1809,6 +1825,10 @@
         <w:t xml:space="preserve">Tadqiqotning predmeti — </w:t>
       </w:r>
       <w:r>
+        <w:rPr>
+          <w:b w:val="0"/>
+          <w:i w:val="0"/>
+        </w:rPr>
         <w:t>mammografiya tasvirlarida o'sma sohalarini aniqlash, BI-RADS bo'yicha tasniflash va avtomatik xulosa shakllantirishning usul, algoritm va dasturiy vositalari.</w:t>
       </w:r>
     </w:p>
@@ -1824,6 +1844,10 @@
         <w:t xml:space="preserve">Tadqiqotning usullari. </w:t>
       </w:r>
       <w:r>
+        <w:rPr>
+          <w:b w:val="0"/>
+          <w:i w:val="0"/>
+        </w:rPr>
         <w:t>Tadqiqotda chuqur o'rganish (konvolyutsion neyron tarmoqlar, o'zaro e'tibor mexanizmi, kodlovchi-dekodlovchi arxitekturalar), tartibli (ordinal) regressiya, radiomik tahlil va tekstura tahlili (GLCM), raqamli tasvirga ishlov berish, optimallashtirish nazariyasi, ehtimollar nazariyasi va matematik statistika, dasturiy injiniring hamda ma'lumotlarni intellektual tahlil usullaridan foydalanilgan.</w:t>
       </w:r>
     </w:p>
@@ -1833,22 +1857,10 @@
       </w:pPr>
       <w:r>
         <w:rPr>
-          <w:b w:val="0"/>
-          <w:i w:val="0"/>
-        </w:rPr>
-      </w:r>
-      <w:r>
-        <w:rPr>
           <w:b/>
           <w:i w:val="0"/>
         </w:rPr>
         <w:t>Tadqiqotning ilmiy yangiligi quyidagilardan iborat:</w:t>
-      </w:r>
-      <w:r>
-        <w:rPr>
-          <w:b w:val="0"/>
-          <w:i w:val="0"/>
-        </w:rPr>
       </w:r>
     </w:p>
     <w:p>
@@ -1858,18 +1870,15 @@
       </w:pPr>
       <w:r>
         <w:rPr>
+          <w:b/>
+          <w:i w:val="0"/>
+        </w:rPr>
+        <w:t>birinchi marta</w:t>
+      </w:r>
+      <w:r>
+        <w:rPr>
           <w:b w:val="0"/>
-        </w:rPr>
-      </w:r>
-      <w:r>
-        <w:rPr>
-          <w:b/>
-        </w:rPr>
-        <w:t>birinchi marta</w:t>
-      </w:r>
-      <w:r>
-        <w:rPr>
-          <w:b w:val="0"/>
+          <w:i w:val="0"/>
         </w:rPr>
         <w:t xml:space="preserve"> har bir xususiyat miqyosida chap va ufqiy akslangan o'ng kontralateral xususiyat xaritalari o'rtasida o'zaro e'tiborni hisoblovchi, nolga initsializatsiyalanadigan o'rganiluvchi α koeffitsiyenti bilan boshqariladigan ikki tomonlama o'zaro e'tibor (BCA) bloki taklif etilgan, bu esa kontralateral asimmetriyani yagona uchidan-uchiga (end-to-end) o'rgatiladigan tarzda modelga kiritadi;</w:t>
       </w:r>
@@ -1882,18 +1891,21 @@
       <w:r>
         <w:rPr>
           <w:b w:val="0"/>
+          <w:i w:val="0"/>
         </w:rPr>
         <w:t xml:space="preserve">bir tomonning kraniokaudal (CC) va mediolateral qiyshiq (MLO) ko'rinishlari o'rtasida obyektlik muvofiqligini ta'minlovchi, o'rganiluvchi kanalli darvozaga ega ko'rinishlararo muvofiqlik (IVC) moduli </w:t>
       </w:r>
       <w:r>
         <w:rPr>
           <w:b/>
+          <w:i w:val="0"/>
         </w:rPr>
         <w:t>ishlab chiqilgan</w:t>
       </w:r>
       <w:r>
         <w:rPr>
           <w:b w:val="0"/>
+          <w:i w:val="0"/>
         </w:rPr>
         <w:t>;</w:t>
       </w:r>
@@ -1906,18 +1918,21 @@
       <w:r>
         <w:rPr>
           <w:b w:val="0"/>
+          <w:i w:val="0"/>
         </w:rPr>
         <w:t xml:space="preserve">BI-RADS kategoriyasini qat'iy monoton ostonalarga ega kumulyativ bog'lanish modeli orqali baholovchi, nominal kross-entropiya o'rniga ordinal yo'qotish funksiyasidan foydalanuvchi ordinal regressiya boshi </w:t>
       </w:r>
       <w:r>
         <w:rPr>
           <w:b/>
+          <w:i w:val="0"/>
         </w:rPr>
         <w:t>taklif etilgan</w:t>
       </w:r>
       <w:r>
         <w:rPr>
           <w:b w:val="0"/>
+          <w:i w:val="0"/>
         </w:rPr>
         <w:t>;</w:t>
       </w:r>
@@ -1930,18 +1945,21 @@
       <w:r>
         <w:rPr>
           <w:b w:val="0"/>
+          <w:i w:val="0"/>
         </w:rPr>
         <w:t xml:space="preserve">radiomik (tekstura, shakl, intensivlik) belgilarni chuqur tasvirlovchilar bilan birlashtirib, modelning izohlanuvchanligini oshiruvchi va «qora quti» muammosini yumshatuvchi gibrid arxitektura </w:t>
       </w:r>
       <w:r>
         <w:rPr>
           <w:b/>
+          <w:i w:val="0"/>
         </w:rPr>
         <w:t>asoslangan</w:t>
       </w:r>
       <w:r>
         <w:rPr>
           <w:b w:val="0"/>
+          <w:i w:val="0"/>
         </w:rPr>
         <w:t>;</w:t>
       </w:r>
@@ -1954,18 +1972,21 @@
       <w:r>
         <w:rPr>
           <w:b w:val="0"/>
+          <w:i w:val="0"/>
         </w:rPr>
         <w:t xml:space="preserve">aniqlangan strukturaviy topilmalardan butunlay lokal til modeli yordamida grounded (ma'lumot to'qimaydigan) avtomatik klinik xulosa shakllantiruvchi hamda uni DICOM SR sifatida eksport qiluvchi, PACS bilan integratsiyalashgan dasturiy yondashuv </w:t>
       </w:r>
       <w:r>
         <w:rPr>
           <w:b/>
+          <w:i w:val="0"/>
         </w:rPr>
         <w:t>ishlab chiqilgan</w:t>
       </w:r>
       <w:r>
         <w:rPr>
           <w:b w:val="0"/>
+          <w:i w:val="0"/>
         </w:rPr>
         <w:t>.</w:t>
       </w:r>
@@ -1976,22 +1997,10 @@
       </w:pPr>
       <w:r>
         <w:rPr>
-          <w:b w:val="0"/>
-          <w:i w:val="0"/>
-        </w:rPr>
-      </w:r>
-      <w:r>
-        <w:rPr>
           <w:b/>
           <w:i w:val="0"/>
         </w:rPr>
         <w:t>Tadqiqotning amaliy natijalari:</w:t>
-      </w:r>
-      <w:r>
-        <w:rPr>
-          <w:b w:val="0"/>
-          <w:i w:val="0"/>
-        </w:rPr>
       </w:r>
     </w:p>
     <w:p>
@@ -2002,6 +2011,7 @@
       <w:r>
         <w:rPr>
           <w:b w:val="0"/>
+          <w:i w:val="0"/>
         </w:rPr>
         <w:t>DICOM ko'ruvchi, annotatsiya, AI inference, GPU'da model o'qitish, avtomatik hisobot va PACS integratsiyasini birlashtirgan MAMOGRAF dasturiy majmuasi;</w:t>
       </w:r>
@@ -2014,6 +2024,7 @@
       <w:r>
         <w:rPr>
           <w:b w:val="0"/>
+          <w:i w:val="0"/>
         </w:rPr>
         <w:t>jonli metrikalar va resurslar monitoringi bilan GPU'da model o'qitish interfeysi (Model Studio);</w:t>
       </w:r>
@@ -2026,6 +2037,7 @@
       <w:r>
         <w:rPr>
           <w:b w:val="0"/>
+          <w:i w:val="0"/>
         </w:rPr>
         <w:t>tashqi API kalitini va internetni talab qilmaydigan, butunlay lokal ishlovchi avtomatik hisobot generatori va DICOM SR eksporti.</w:t>
       </w:r>
@@ -2042,6 +2054,10 @@
         <w:t xml:space="preserve">Tadqiqot natijalarining ishonchliligi </w:t>
       </w:r>
       <w:r>
+        <w:rPr>
+          <w:b w:val="0"/>
+          <w:i w:val="0"/>
+        </w:rPr>
         <w:t>algoritmlarni ishlab chiqishda chuqur o'rganish, optimallashtirish va radiomik tahlilning asoslangan matematik apparatidan foydalanilganligi, taklif etilgan modellarning ochiq VinDr-Mammo ma'lumotlar to'plamida baholanganligi va olingan natijalarning umume'tirof etilgan metrikalar (mAP, F1, IoU, sezgirlik) bilan tasdiqlanganligi bilan izohlanadi.</w:t>
       </w:r>
     </w:p>
@@ -2057,6 +2073,10 @@
         <w:t xml:space="preserve">Tadqiqotning ilmiy va amaliy ahamiyati. </w:t>
       </w:r>
       <w:r>
+        <w:rPr>
+          <w:b w:val="0"/>
+          <w:i w:val="0"/>
+        </w:rPr>
         <w:t>Ilmiy ahamiyati — mammografiyada ikki tomonlama asimmetriya, ko'pko'rinishli muvofiqlik va ordinal baholash kabi klinik induktiv taxminlarni rasmiy matematik shaklda ifodalashdan hamda ularning gradiyent xossalarini tahlil qilishdan iborat. Amaliy ahamiyati — ishlab chiqilgan dasturiy majmuani radiologiya bo'limlarida tashxis jarayonini tezlashtirish, kuzatuvchilararo o'zgaruvchanlikni kamaytirish va erta aniqlashni qo'llab-quvvatlash uchun qo'llash imkoniyatidir.</w:t>
       </w:r>
     </w:p>
@@ -2072,6 +2092,10 @@
         <w:t xml:space="preserve">Tadqiqot natijalarining joriy qilinishi. </w:t>
       </w:r>
       <w:r>
+        <w:rPr>
+          <w:b w:val="0"/>
+          <w:i w:val="0"/>
+        </w:rPr>
         <w:t>Tadqiqotda ishlab chiqilgan algoritmlar va MAMOGRAF dasturiy majmuasi Respublika ixtisoslashtirilgan Onkologiya va Radiologiya ilmiy-amaliy tibbiy markazidan olingan klinik mammografiya ma'lumotlari asosida sinovdan o'tkazilgan. [Joriy etilish dalolatnomasining raqami va sanasini to'ldiring.]</w:t>
       </w:r>
     </w:p>
@@ -2087,6 +2111,10 @@
         <w:t xml:space="preserve">Tadqiqot natijalarining aprobatsiyasi. </w:t>
       </w:r>
       <w:r>
+        <w:rPr>
+          <w:b w:val="0"/>
+          <w:i w:val="0"/>
+        </w:rPr>
         <w:t>Tadqiqot natijalari xalqaro ilmiy-amaliy anjumanda muhokama qilingan: «Kibernetika — zamonaviy sun'iy intellektning poydevori» xalqaro ilmiy-amaliy anjumani (Toshkent, 2026-yil 15–16-aprel), «Image classification algorithms based on neural network technologies for medical image analysis» ma'ruzasi.</w:t>
       </w:r>
     </w:p>
@@ -2102,6 +2130,10 @@
         <w:t xml:space="preserve">Tadqiqot natijalarining e'lon qilinganligi. </w:t>
       </w:r>
       <w:r>
+        <w:rPr>
+          <w:b w:val="0"/>
+          <w:i w:val="0"/>
+        </w:rPr>
         <w:t>Dissertatsiya mavzusi bo'yicha bir nechta ilmiy ish e'lon qilingan, jumladan:</w:t>
       </w:r>
     </w:p>
@@ -2113,6 +2145,7 @@
       <w:r>
         <w:rPr>
           <w:b w:val="0"/>
+          <w:i w:val="0"/>
         </w:rPr>
         <w:t>Turaqulov Sh.X. BCA-YOLO: ikki tomonlama o'zaro e'tibor, ko'rinishlararo muvofiqlik va ordinal BI-RADS regressiyasi asosida mammografik shikastlanishlarni aniqlash // Raqamli texnologiyalarning nazariy va amaliy masalalari xalqaro jurnali. — 2026. — № 9(2). — B. 58–66. — ISSN 2181-3086.</w:t>
       </w:r>
@@ -2125,6 +2158,7 @@
       <w:r>
         <w:rPr>
           <w:b w:val="0"/>
+          <w:i w:val="0"/>
         </w:rPr>
         <w:t>Khamdamov R., Turaqulov Sh.X. TILLNet-Det: A Text-Informed Lesion Localization Network for Multilingual Mammography Detection in Low-Resource Settings // International Journal of Informatics and Data Science Research. — 2026.</w:t>
       </w:r>
@@ -2137,6 +2171,7 @@
       <w:r>
         <w:rPr>
           <w:b w:val="0"/>
+          <w:i w:val="0"/>
         </w:rPr>
         <w:t>Khamdamov R., Turaqulov Sh.X. Annotatsiyasi kam sharoitlarda ko'p tilli mammografik o'choqlarni aniqlash uchun yopiq halqali tizim: radiolog-inson hamkorligi bilan matnga yo'naltirilgan zaif nazoratli o'qitish // Raqamli Transformatsiya va Sun'iy Intellekt. — 2026. — DOI: 10.5281/zenodo.20816862.</w:t>
       </w:r>
@@ -2149,6 +2184,7 @@
       <w:r>
         <w:rPr>
           <w:b w:val="0"/>
+          <w:i w:val="0"/>
         </w:rPr>
         <w:t>Turaqulov Sh., Khamdamov R. Image classification algorithms based on neural network technologies for medical image analysis // «Kibernetika — zamonaviy sun'iy intellektning poydevori» xalqaro ilmiy-amaliy anjumani. — Toshkent, 2026.</w:t>
       </w:r>
@@ -2165,6 +2201,10 @@
         <w:t xml:space="preserve">Dissertatsiyaning tuzilishi va hajmi. </w:t>
       </w:r>
       <w:r>
+        <w:rPr>
+          <w:b w:val="0"/>
+          <w:i w:val="0"/>
+        </w:rPr>
         <w:t>Dissertatsiya kirish, to'rtta bob, xulosa, foydalanilgan adabiyotlar ro'yxati va ilovalardan iborat. Ishda jadvallar, formulalar va rasmlar keltirilgan.</w:t>
       </w:r>
     </w:p>
@@ -2914,12 +2954,6 @@
       </w:pPr>
       <w:r>
         <w:rPr>
-          <w:b w:val="0"/>
-          <w:i w:val="0"/>
-        </w:rPr>
-      </w:r>
-      <w:r>
-        <w:rPr>
           <w:b/>
           <w:i w:val="0"/>
         </w:rPr>
@@ -3097,12 +3131,6 @@
       </w:pPr>
       <w:r>
         <w:rPr>
-          <w:b w:val="0"/>
-          <w:i w:val="0"/>
-        </w:rPr>
-      </w:r>
-      <w:r>
-        <w:rPr>
           <w:b/>
           <w:i w:val="0"/>
         </w:rPr>
@@ -3151,12 +3179,6 @@
       </w:pPr>
       <w:r>
         <w:rPr>
-          <w:b w:val="0"/>
-          <w:i w:val="0"/>
-        </w:rPr>
-      </w:r>
-      <w:r>
-        <w:rPr>
           <w:b/>
           <w:i w:val="0"/>
         </w:rPr>
@@ -3175,12 +3197,6 @@
         <w:ind w:firstLine="567"/>
         <w:jc w:val="both"/>
       </w:pPr>
-      <w:r>
-        <w:rPr>
-          <w:b w:val="0"/>
-          <w:i w:val="0"/>
-        </w:rPr>
-      </w:r>
       <w:r>
         <w:rPr>
           <w:b/>
@@ -3749,12 +3765,6 @@
         <w:ind w:firstLine="567"/>
         <w:jc w:val="both"/>
       </w:pPr>
-      <w:r>
-        <w:rPr>
-          <w:b w:val="0"/>
-          <w:i w:val="0"/>
-        </w:rPr>
-      </w:r>
       <w:r>
         <w:rPr>
           <w:b/>
@@ -4562,6 +4572,7 @@
       <w:r>
         <w:rPr>
           <w:b w:val="0"/>
+          <w:i w:val="0"/>
         </w:rPr>
         <w:t>Ko'krak saratonini erta aniqlashda skrining mammografiyasi va to'rt ko'rinishli (CC/MLO) tahlil hal qiluvchi ahamiyatga ega; BI-RADS shkalasi ordinal tabiatga ega.</w:t>
       </w:r>
@@ -4574,6 +4585,7 @@
       <w:r>
         <w:rPr>
           <w:b w:val="0"/>
+          <w:i w:val="0"/>
         </w:rPr>
         <w:t>DICOM standarti va PACS tibbiy tasvirlarni saqlash va almashishni belgilaydi; PHI anonimlashtirish maxfiylik talabidir.</w:t>
       </w:r>
@@ -4586,6 +4598,7 @@
       <w:r>
         <w:rPr>
           <w:b w:val="0"/>
+          <w:i w:val="0"/>
         </w:rPr>
         <w:t>Mavjud chuqur o'rganish detektorlari to'rt ko'rinishni mustaqil qayta ishlab, ikki tomonlama va ko'rinishlararo induktiv taxminlardan to'liq foydalanmaydi.</w:t>
       </w:r>
@@ -4598,6 +4611,7 @@
       <w:r>
         <w:rPr>
           <w:b w:val="0"/>
+          <w:i w:val="0"/>
         </w:rPr>
         <w:t>O'zaro e'tibor, ordinal regressiya va radiomika alohida-alohida o'rganilgan, biroq yagona mammografiya yechimida birlashtirilmagan.</w:t>
       </w:r>
@@ -4610,6 +4624,7 @@
       <w:r>
         <w:rPr>
           <w:b w:val="0"/>
+          <w:i w:val="0"/>
         </w:rPr>
         <w:t>Aniqlangan ilmiy bo'shliq BCA-YOLO algoritmi va MAMOGRAF dasturiy majmuasini ishlab chiqishni asoslab beradi.</w:t>
       </w:r>
@@ -4649,7 +4664,278 @@
           <w:b w:val="0"/>
           <w:i w:val="0"/>
         </w:rPr>
-        <w:t xml:space="preserve">Bitta mammografik tadqiqot to'rtta ko'rinishdan iborat: $\{L\text{-}CC, R\text{-}CC, L\text{-}MLO, R\text{-}MLO\}$. Har bir ko'rinish $v$ uchun bazaviy tarmoq $S$ ta miqyosda xususiyat xaritalari $F_v^{(s)} \in \mathbb{R}^{C_s \times H_s \times W_s}$ ($s=1,\dots,S$) hosil qiladi. Detektsiya boshi har bir to'r pozitsiyasi uchun quti koordinatalari, obyektlik logiti $o_v^{(s)}$ va BI-RADS chiqishini bashorat qiladi. Maqsad — bu to'rt oqimni klinik induktiv taxminlar (ikki tomonlama asimmetriya, ko'rinishlararo muvofiqlik, ordinal baholash) bilan boyitib, yagona, uchidan-uchiga o'rgatiladigan model qurishdir. Taklif etilayotgan </w:t>
+        <w:t xml:space="preserve">Bitta mammografik tadqiqot to'rtta ko'rinishdan iborat: </w:t>
+      </w:r>
+      <m:oMath>
+        <m:r>
+          <m:rPr>
+            <m:sty m:val="p"/>
+          </m:rPr>
+          <m:t xml:space="preserve">{</m:t>
+        </m:r>
+        <m:r>
+          <m:t xml:space="preserve">L</m:t>
+        </m:r>
+        <m:r>
+          <m:rPr>
+            <m:sty m:val="p"/>
+          </m:rPr>
+          <m:t xml:space="preserve">-</m:t>
+        </m:r>
+        <m:r>
+          <m:t xml:space="preserve">CC</m:t>
+        </m:r>
+        <m:r>
+          <m:rPr>
+            <m:sty m:val="p"/>
+          </m:rPr>
+          <m:t xml:space="preserve">, </m:t>
+        </m:r>
+        <m:r>
+          <m:t xml:space="preserve">R</m:t>
+        </m:r>
+        <m:r>
+          <m:rPr>
+            <m:sty m:val="p"/>
+          </m:rPr>
+          <m:t xml:space="preserve">-</m:t>
+        </m:r>
+        <m:r>
+          <m:t xml:space="preserve">CC</m:t>
+        </m:r>
+        <m:r>
+          <m:rPr>
+            <m:sty m:val="p"/>
+          </m:rPr>
+          <m:t xml:space="preserve">, </m:t>
+        </m:r>
+        <m:r>
+          <m:t xml:space="preserve">L</m:t>
+        </m:r>
+        <m:r>
+          <m:rPr>
+            <m:sty m:val="p"/>
+          </m:rPr>
+          <m:t xml:space="preserve">-</m:t>
+        </m:r>
+        <m:r>
+          <m:t xml:space="preserve">MLO</m:t>
+        </m:r>
+        <m:r>
+          <m:rPr>
+            <m:sty m:val="p"/>
+          </m:rPr>
+          <m:t xml:space="preserve">, </m:t>
+        </m:r>
+        <m:r>
+          <m:t xml:space="preserve">R</m:t>
+        </m:r>
+        <m:r>
+          <m:rPr>
+            <m:sty m:val="p"/>
+          </m:rPr>
+          <m:t xml:space="preserve">-</m:t>
+        </m:r>
+        <m:r>
+          <m:t xml:space="preserve">MLO</m:t>
+        </m:r>
+        <m:r>
+          <m:rPr>
+            <m:sty m:val="p"/>
+          </m:rPr>
+          <m:t xml:space="preserve">}</m:t>
+        </m:r>
+      </m:oMath>
+      <w:r>
+        <w:rPr>
+          <w:b w:val="0"/>
+          <w:i w:val="0"/>
+        </w:rPr>
+        <w:t xml:space="preserve">. Har bir ko'rinish </w:t>
+      </w:r>
+      <m:oMath>
+        <m:r>
+          <m:t xml:space="preserve">v</m:t>
+        </m:r>
+      </m:oMath>
+      <w:r>
+        <w:rPr>
+          <w:b w:val="0"/>
+          <w:i w:val="0"/>
+        </w:rPr>
+        <w:t xml:space="preserve"> uchun bazaviy tarmoq </w:t>
+      </w:r>
+      <m:oMath>
+        <m:r>
+          <m:t xml:space="preserve">S</m:t>
+        </m:r>
+      </m:oMath>
+      <w:r>
+        <w:rPr>
+          <w:b w:val="0"/>
+          <w:i w:val="0"/>
+        </w:rPr>
+        <w:t xml:space="preserve"> ta miqyosda xususiyat xaritalari </w:t>
+      </w:r>
+      <m:oMath>
+        <m:sSubSup>
+          <m:e>
+            <m:r>
+              <m:t xml:space="preserve">F</m:t>
+            </m:r>
+          </m:e>
+          <m:sub>
+            <m:r>
+              <m:t xml:space="preserve">v</m:t>
+            </m:r>
+          </m:sub>
+          <m:sup>
+            <m:r>
+              <m:rPr>
+                <m:sty m:val="p"/>
+              </m:rPr>
+              <m:t xml:space="preserve">(</m:t>
+            </m:r>
+            <m:r>
+              <m:t xml:space="preserve">s</m:t>
+            </m:r>
+            <m:r>
+              <m:rPr>
+                <m:sty m:val="p"/>
+              </m:rPr>
+              <m:t xml:space="preserve">)</m:t>
+            </m:r>
+          </m:sup>
+        </m:sSubSup>
+        <m:r>
+          <m:rPr>
+            <m:sty m:val="p"/>
+          </m:rPr>
+          <m:t xml:space="preserve"> ∈ </m:t>
+        </m:r>
+        <m:sSup>
+          <m:e>
+            <m:r>
+              <m:t xml:space="preserve">ℝ</m:t>
+            </m:r>
+          </m:e>
+          <m:sup>
+            <m:sSub>
+              <m:e>
+                <m:r>
+                  <m:t xml:space="preserve">C</m:t>
+                </m:r>
+              </m:e>
+              <m:sub>
+                <m:r>
+                  <m:t xml:space="preserve">s</m:t>
+                </m:r>
+              </m:sub>
+            </m:sSub>
+            <m:r>
+              <m:rPr>
+                <m:sty m:val="p"/>
+              </m:rPr>
+              <m:t xml:space="preserve"> × </m:t>
+            </m:r>
+            <m:sSub>
+              <m:e>
+                <m:r>
+                  <m:t xml:space="preserve">H</m:t>
+                </m:r>
+              </m:e>
+              <m:sub>
+                <m:r>
+                  <m:t xml:space="preserve">s</m:t>
+                </m:r>
+              </m:sub>
+            </m:sSub>
+            <m:r>
+              <m:rPr>
+                <m:sty m:val="p"/>
+              </m:rPr>
+              <m:t xml:space="preserve"> × </m:t>
+            </m:r>
+            <m:sSub>
+              <m:e>
+                <m:r>
+                  <m:t xml:space="preserve">W</m:t>
+                </m:r>
+              </m:e>
+              <m:sub>
+                <m:r>
+                  <m:t xml:space="preserve">s</m:t>
+                </m:r>
+              </m:sub>
+            </m:sSub>
+          </m:sup>
+        </m:sSup>
+      </m:oMath>
+      <w:r>
+        <w:rPr>
+          <w:b w:val="0"/>
+          <w:i w:val="0"/>
+        </w:rPr>
+        <w:t xml:space="preserve"> (</w:t>
+      </w:r>
+      <m:oMath>
+        <m:r>
+          <m:t xml:space="preserve">s</m:t>
+        </m:r>
+        <m:r>
+          <m:rPr>
+            <m:sty m:val="p"/>
+          </m:rPr>
+          <m:t xml:space="preserve">=1,…,</m:t>
+        </m:r>
+        <m:r>
+          <m:t xml:space="preserve">S</m:t>
+        </m:r>
+      </m:oMath>
+      <w:r>
+        <w:rPr>
+          <w:b w:val="0"/>
+          <w:i w:val="0"/>
+        </w:rPr>
+        <w:t xml:space="preserve">) hosil qiladi. Detektsiya boshi har bir to'r pozitsiyasi uchun quti koordinatalari, obyektlik logiti </w:t>
+      </w:r>
+      <m:oMath>
+        <m:sSubSup>
+          <m:e>
+            <m:r>
+              <m:t xml:space="preserve">o</m:t>
+            </m:r>
+          </m:e>
+          <m:sub>
+            <m:r>
+              <m:t xml:space="preserve">v</m:t>
+            </m:r>
+          </m:sub>
+          <m:sup>
+            <m:r>
+              <m:rPr>
+                <m:sty m:val="p"/>
+              </m:rPr>
+              <m:t xml:space="preserve">(</m:t>
+            </m:r>
+            <m:r>
+              <m:t xml:space="preserve">s</m:t>
+            </m:r>
+            <m:r>
+              <m:rPr>
+                <m:sty m:val="p"/>
+              </m:rPr>
+              <m:t xml:space="preserve">)</m:t>
+            </m:r>
+          </m:sup>
+        </m:sSubSup>
+      </m:oMath>
+      <w:r>
+        <w:rPr>
+          <w:b w:val="0"/>
+          <w:i w:val="0"/>
+        </w:rPr>
+        <w:t xml:space="preserve"> va BI-RADS chiqishini bashorat qiladi. Maqsad — bu to'rt oqimni klinik induktiv taxminlar (ikki tomonlama asimmetriya, ko'rinishlararo muvofiqlik, ordinal baholash) bilan boyitib, yagona, uchidan-uchiga o'rgatiladigan model qurishdir. Taklif etilayotgan </w:t>
       </w:r>
       <w:r>
         <w:rPr>
@@ -4727,7 +5013,166 @@
           <w:b w:val="0"/>
           <w:i w:val="0"/>
         </w:rPr>
-        <w:t>Bazaviy tarmoq uch miqyosli xususiyat xaritalarini hosil qiladi: yuqori ruxsatdagi (katta $H_s \times W_s$, kichik $C_s$) xaritalar mayda obyektlarni (mikrokalsifikatsiyalar), past ruxsatdagi (kichik fazoviy, katta $C_s$) xaritalar esa yirik obyektlarni (massalar) aniqlash uchun javobgar. Kanal kengliklari odatda $(C_1,C_2,C_3)=(256,512,512)$ qiymatlarni oladi. Xususiyat piramidasi (FPN/PAN) turli miqyoslardagi ma'lumotni yuqoridan-pastga va pastdan-yuqoriga yo'llar orqali birlashtiradi, bu ko'p o'lchamli aniqlashni ta'minlaydi.</w:t>
+        <w:t xml:space="preserve">Bazaviy tarmoq uch miqyosli xususiyat xaritalarini hosil qiladi: yuqori ruxsatdagi (katta </w:t>
+      </w:r>
+      <m:oMath>
+        <m:sSub>
+          <m:e>
+            <m:r>
+              <m:t xml:space="preserve">H</m:t>
+            </m:r>
+          </m:e>
+          <m:sub>
+            <m:r>
+              <m:t xml:space="preserve">s</m:t>
+            </m:r>
+          </m:sub>
+        </m:sSub>
+        <m:r>
+          <m:rPr>
+            <m:sty m:val="p"/>
+          </m:rPr>
+          <m:t xml:space="preserve"> × </m:t>
+        </m:r>
+        <m:sSub>
+          <m:e>
+            <m:r>
+              <m:t xml:space="preserve">W</m:t>
+            </m:r>
+          </m:e>
+          <m:sub>
+            <m:r>
+              <m:t xml:space="preserve">s</m:t>
+            </m:r>
+          </m:sub>
+        </m:sSub>
+      </m:oMath>
+      <w:r>
+        <w:rPr>
+          <w:b w:val="0"/>
+          <w:i w:val="0"/>
+        </w:rPr>
+        <w:t xml:space="preserve">, kichik </w:t>
+      </w:r>
+      <m:oMath>
+        <m:sSub>
+          <m:e>
+            <m:r>
+              <m:t xml:space="preserve">C</m:t>
+            </m:r>
+          </m:e>
+          <m:sub>
+            <m:r>
+              <m:t xml:space="preserve">s</m:t>
+            </m:r>
+          </m:sub>
+        </m:sSub>
+      </m:oMath>
+      <w:r>
+        <w:rPr>
+          <w:b w:val="0"/>
+          <w:i w:val="0"/>
+        </w:rPr>
+        <w:t xml:space="preserve">) xaritalar mayda obyektlarni (mikrokalsifikatsiyalar), past ruxsatdagi (kichik fazoviy, katta </w:t>
+      </w:r>
+      <m:oMath>
+        <m:sSub>
+          <m:e>
+            <m:r>
+              <m:t xml:space="preserve">C</m:t>
+            </m:r>
+          </m:e>
+          <m:sub>
+            <m:r>
+              <m:t xml:space="preserve">s</m:t>
+            </m:r>
+          </m:sub>
+        </m:sSub>
+      </m:oMath>
+      <w:r>
+        <w:rPr>
+          <w:b w:val="0"/>
+          <w:i w:val="0"/>
+        </w:rPr>
+        <w:t xml:space="preserve">) xaritalar esa yirik obyektlarni (massalar) aniqlash uchun javobgar. Kanal kengliklari odatda </w:t>
+      </w:r>
+      <m:oMath>
+        <m:r>
+          <m:rPr>
+            <m:sty m:val="p"/>
+          </m:rPr>
+          <m:t xml:space="preserve">(</m:t>
+        </m:r>
+        <m:sSub>
+          <m:e>
+            <m:r>
+              <m:t xml:space="preserve">C</m:t>
+            </m:r>
+          </m:e>
+          <m:sub>
+            <m:r>
+              <m:rPr>
+                <m:sty m:val="p"/>
+              </m:rPr>
+              <m:t xml:space="preserve">1</m:t>
+            </m:r>
+          </m:sub>
+        </m:sSub>
+        <m:r>
+          <m:rPr>
+            <m:sty m:val="p"/>
+          </m:rPr>
+          <m:t xml:space="preserve">,</m:t>
+        </m:r>
+        <m:sSub>
+          <m:e>
+            <m:r>
+              <m:t xml:space="preserve">C</m:t>
+            </m:r>
+          </m:e>
+          <m:sub>
+            <m:r>
+              <m:rPr>
+                <m:sty m:val="p"/>
+              </m:rPr>
+              <m:t xml:space="preserve">2</m:t>
+            </m:r>
+          </m:sub>
+        </m:sSub>
+        <m:r>
+          <m:rPr>
+            <m:sty m:val="p"/>
+          </m:rPr>
+          <m:t xml:space="preserve">,</m:t>
+        </m:r>
+        <m:sSub>
+          <m:e>
+            <m:r>
+              <m:t xml:space="preserve">C</m:t>
+            </m:r>
+          </m:e>
+          <m:sub>
+            <m:r>
+              <m:rPr>
+                <m:sty m:val="p"/>
+              </m:rPr>
+              <m:t xml:space="preserve">3</m:t>
+            </m:r>
+          </m:sub>
+        </m:sSub>
+        <m:r>
+          <m:rPr>
+            <m:sty m:val="p"/>
+          </m:rPr>
+          <m:t xml:space="preserve">)=(256,512,512)</m:t>
+        </m:r>
+      </m:oMath>
+      <w:r>
+        <w:rPr>
+          <w:b w:val="0"/>
+          <w:i w:val="0"/>
+        </w:rPr>
+        <w:t xml:space="preserve"> qiymatlarni oladi. Xususiyat piramidasi (FPN/PAN) turli miqyoslardagi ma'lumotni yuqoridan-pastga va pastdan-yuqoriga yo'llar orqali birlashtiradi, bu ko'p o'lchamli aniqlashni ta'minlaydi.</w:t>
       </w:r>
     </w:p>
     <w:p>
@@ -4761,7 +5206,40 @@
           <w:b w:val="0"/>
           <w:i w:val="0"/>
         </w:rPr>
-        <w:t xml:space="preserve">Radiolog chap va o'ng ko'krakni solishtirib asimmetriyani aniqlaydi. Buni modellashtirish uchun har bir miqyos $s$ da chap ko'rinish xususiyati $F_L$ va </w:t>
+        <w:t xml:space="preserve">Radiolog chap va o'ng ko'krakni solishtirib asimmetriyani aniqlaydi. Buni modellashtirish uchun har bir miqyos </w:t>
+      </w:r>
+      <m:oMath>
+        <m:r>
+          <m:t xml:space="preserve">s</m:t>
+        </m:r>
+      </m:oMath>
+      <w:r>
+        <w:rPr>
+          <w:b w:val="0"/>
+          <w:i w:val="0"/>
+        </w:rPr>
+        <w:t xml:space="preserve"> da chap ko'rinish xususiyati </w:t>
+      </w:r>
+      <m:oMath>
+        <m:sSub>
+          <m:e>
+            <m:r>
+              <m:t xml:space="preserve">F</m:t>
+            </m:r>
+          </m:e>
+          <m:sub>
+            <m:r>
+              <m:t xml:space="preserve">L</m:t>
+            </m:r>
+          </m:sub>
+        </m:sSub>
+      </m:oMath>
+      <w:r>
+        <w:rPr>
+          <w:b w:val="0"/>
+          <w:i w:val="0"/>
+        </w:rPr>
+        <w:t xml:space="preserve"> va </w:t>
       </w:r>
       <w:r>
         <w:rPr>
@@ -4775,7 +5253,64 @@
           <w:b w:val="0"/>
           <w:i w:val="0"/>
         </w:rPr>
-        <w:t xml:space="preserve"> o'ng ko'rinish xususiyati $F_R$ o'rtasida o'zaro e'tibor hisoblanadi (akslantirish ikki ko'krak anatomiyasini fazoviy tenglashtiradi). So'rov $Q$ chap oqimdan, kalit $K$ va qiymat $V$ o'ng oqimdan chiziqli proyeksiyalar orqali olinadi:</w:t>
+        <w:t xml:space="preserve"> o'ng ko'rinish xususiyati </w:t>
+      </w:r>
+      <m:oMath>
+        <m:sSub>
+          <m:e>
+            <m:r>
+              <m:t xml:space="preserve">F</m:t>
+            </m:r>
+          </m:e>
+          <m:sub>
+            <m:r>
+              <m:t xml:space="preserve">R</m:t>
+            </m:r>
+          </m:sub>
+        </m:sSub>
+      </m:oMath>
+      <w:r>
+        <w:rPr>
+          <w:b w:val="0"/>
+          <w:i w:val="0"/>
+        </w:rPr>
+        <w:t xml:space="preserve"> o'rtasida o'zaro e'tibor hisoblanadi (akslantirish ikki ko'krak anatomiyasini fazoviy tenglashtiradi). So'rov </w:t>
+      </w:r>
+      <m:oMath>
+        <m:r>
+          <m:t xml:space="preserve">Q</m:t>
+        </m:r>
+      </m:oMath>
+      <w:r>
+        <w:rPr>
+          <w:b w:val="0"/>
+          <w:i w:val="0"/>
+        </w:rPr>
+        <w:t xml:space="preserve"> chap oqimdan, kalit </w:t>
+      </w:r>
+      <m:oMath>
+        <m:r>
+          <m:t xml:space="preserve">K</m:t>
+        </m:r>
+      </m:oMath>
+      <w:r>
+        <w:rPr>
+          <w:b w:val="0"/>
+          <w:i w:val="0"/>
+        </w:rPr>
+        <w:t xml:space="preserve"> va qiymat </w:t>
+      </w:r>
+      <m:oMath>
+        <m:r>
+          <m:t xml:space="preserve">V</m:t>
+        </m:r>
+      </m:oMath>
+      <w:r>
+        <w:rPr>
+          <w:b w:val="0"/>
+          <w:i w:val="0"/>
+        </w:rPr>
+        <w:t xml:space="preserve"> o'ng oqimdan chiziqli proyeksiyalar orqali olinadi:</w:t>
       </w:r>
     </w:p>
     <w:p>
@@ -4833,7 +5368,49 @@
           <w:b w:val="0"/>
           <w:i w:val="0"/>
         </w:rPr>
-        <w:t>Olingan kontralateral farq signali $\Delta F_L$ o'rganiluvchi skalyar $\alpha$ koeffitsiyenti bilan qoldiq (residual) tarzda asosiy xususiyatga qo'shiladi:</w:t>
+        <w:t xml:space="preserve">Olingan kontralateral farq signali </w:t>
+      </w:r>
+      <m:oMath>
+        <m:r>
+          <m:t xml:space="preserve">Δ</m:t>
+        </m:r>
+        <m:r>
+          <m:rPr>
+            <m:sty m:val="p"/>
+          </m:rPr>
+          <m:t xml:space="preserve"> </m:t>
+        </m:r>
+        <m:sSub>
+          <m:e>
+            <m:r>
+              <m:t xml:space="preserve">F</m:t>
+            </m:r>
+          </m:e>
+          <m:sub>
+            <m:r>
+              <m:t xml:space="preserve">L</m:t>
+            </m:r>
+          </m:sub>
+        </m:sSub>
+      </m:oMath>
+      <w:r>
+        <w:rPr>
+          <w:b w:val="0"/>
+          <w:i w:val="0"/>
+        </w:rPr>
+        <w:t xml:space="preserve"> o'rganiluvchi skalyar </w:t>
+      </w:r>
+      <m:oMath>
+        <m:r>
+          <m:t xml:space="preserve">α</m:t>
+        </m:r>
+      </m:oMath>
+      <w:r>
+        <w:rPr>
+          <w:b w:val="0"/>
+          <w:i w:val="0"/>
+        </w:rPr>
+        <w:t xml:space="preserve"> koeffitsiyenti bilan qoldiq (residual) tarzda asosiy xususiyatga qo'shiladi:</w:t>
       </w:r>
     </w:p>
     <w:p>
@@ -4891,7 +5468,19 @@
           <w:b w:val="0"/>
           <w:i w:val="0"/>
         </w:rPr>
-        <w:t xml:space="preserve">Bu yerda muhim tuzilma qarori — $\alpha$ ni </w:t>
+        <w:t xml:space="preserve">Bu yerda muhim tuzilma qarori — </w:t>
+      </w:r>
+      <m:oMath>
+        <m:r>
+          <m:t xml:space="preserve">α</m:t>
+        </m:r>
+      </m:oMath>
+      <w:r>
+        <w:rPr>
+          <w:b w:val="0"/>
+          <w:i w:val="0"/>
+        </w:rPr>
+        <w:t xml:space="preserve"> ni </w:t>
       </w:r>
       <w:r>
         <w:rPr>
@@ -4905,7 +5494,66 @@
           <w:b w:val="0"/>
           <w:i w:val="0"/>
         </w:rPr>
-        <w:t xml:space="preserve"> qilishdir. O'rganish boshida $\alpha=0$ bo'lgani uchun oldinga o'tish aynan bazaviy YOLO modeliga teng bo'ladi, bu esa oldindan o'rgatilgan og'irliklar bilan to'liq moslikni ta'minlaydi va barqaror sozlashga (fine-tuning) imkon beradi. Asimmetriya xaritasi $\bar{A}^{(s)}$ — e'tibor og'irliklarining fazoviy yig'indisi — shikastlanish joylarida cho'qqiga ko'tarilishga o'rgatiladi, bu modelni asimmetriya muhim bo'lgan joylarga yo'naltiradi:</w:t>
+        <w:t xml:space="preserve"> qilishdir. O'rganish boshida </w:t>
+      </w:r>
+      <m:oMath>
+        <m:r>
+          <m:t xml:space="preserve">α</m:t>
+        </m:r>
+        <m:r>
+          <m:rPr>
+            <m:sty m:val="p"/>
+          </m:rPr>
+          <m:t xml:space="preserve">=0</m:t>
+        </m:r>
+      </m:oMath>
+      <w:r>
+        <w:rPr>
+          <w:b w:val="0"/>
+          <w:i w:val="0"/>
+        </w:rPr>
+        <w:t xml:space="preserve"> bo'lgani uchun oldinga o'tish aynan bazaviy YOLO modeliga teng bo'ladi, bu esa oldindan o'rgatilgan og'irliklar bilan to'liq moslikni ta'minlaydi va barqaror sozlashga (fine-tuning) imkon beradi. Asimmetriya xaritasi </w:t>
+      </w:r>
+      <m:oMath>
+        <m:sSup>
+          <m:e>
+            <m:acc>
+              <m:accPr>
+                <m:chr m:val="̄"/>
+                <m:ctrlPr/>
+              </m:accPr>
+              <m:e>
+                <m:r>
+                  <m:t xml:space="preserve">A</m:t>
+                </m:r>
+              </m:e>
+            </m:acc>
+          </m:e>
+          <m:sup>
+            <m:r>
+              <m:rPr>
+                <m:sty m:val="p"/>
+              </m:rPr>
+              <m:t xml:space="preserve">(</m:t>
+            </m:r>
+            <m:r>
+              <m:t xml:space="preserve">s</m:t>
+            </m:r>
+            <m:r>
+              <m:rPr>
+                <m:sty m:val="p"/>
+              </m:rPr>
+              <m:t xml:space="preserve">)</m:t>
+            </m:r>
+          </m:sup>
+        </m:sSup>
+      </m:oMath>
+      <w:r>
+        <w:rPr>
+          <w:b w:val="0"/>
+          <w:i w:val="0"/>
+        </w:rPr>
+        <w:t xml:space="preserve"> — e'tibor og'irliklarining fazoviy yig'indisi — shikastlanish joylarida cho'qqiga ko'tarilishga o'rgatiladi, bu modelni asimmetriya muhim bo'lgan joylarga yo'naltiradi:</w:t>
       </w:r>
     </w:p>
     <w:p>
@@ -4963,7 +5611,117 @@
           <w:b w:val="0"/>
           <w:i w:val="0"/>
         </w:rPr>
-        <w:t>bu yerda $\Omega = \{(s,L),(s,R): s=1,\dots,S\}$ — barcha miqyos va tomonlar to'plami, $m^{(s)}_v$ esa asosiy haqiqat (ground-truth) shikastlanish niqobidan olingan maqsadli xarita.</w:t>
+        <w:t xml:space="preserve">bu yerda </w:t>
+      </w:r>
+      <m:oMath>
+        <m:r>
+          <m:t xml:space="preserve">Ω</m:t>
+        </m:r>
+        <m:r>
+          <m:rPr>
+            <m:sty m:val="p"/>
+          </m:rPr>
+          <m:t xml:space="preserve"> = {(</m:t>
+        </m:r>
+        <m:r>
+          <m:t xml:space="preserve">s</m:t>
+        </m:r>
+        <m:r>
+          <m:rPr>
+            <m:sty m:val="p"/>
+          </m:rPr>
+          <m:t xml:space="preserve">,</m:t>
+        </m:r>
+        <m:r>
+          <m:t xml:space="preserve">L</m:t>
+        </m:r>
+        <m:r>
+          <m:rPr>
+            <m:sty m:val="p"/>
+          </m:rPr>
+          <m:t xml:space="preserve">),(</m:t>
+        </m:r>
+        <m:r>
+          <m:t xml:space="preserve">s</m:t>
+        </m:r>
+        <m:r>
+          <m:rPr>
+            <m:sty m:val="p"/>
+          </m:rPr>
+          <m:t xml:space="preserve">,</m:t>
+        </m:r>
+        <m:r>
+          <m:t xml:space="preserve">R</m:t>
+        </m:r>
+        <m:r>
+          <m:rPr>
+            <m:sty m:val="p"/>
+          </m:rPr>
+          <m:t xml:space="preserve">): </m:t>
+        </m:r>
+        <m:r>
+          <m:t xml:space="preserve">s</m:t>
+        </m:r>
+        <m:r>
+          <m:rPr>
+            <m:sty m:val="p"/>
+          </m:rPr>
+          <m:t xml:space="preserve">=1,…,</m:t>
+        </m:r>
+        <m:r>
+          <m:t xml:space="preserve">S</m:t>
+        </m:r>
+        <m:r>
+          <m:rPr>
+            <m:sty m:val="p"/>
+          </m:rPr>
+          <m:t xml:space="preserve">}</m:t>
+        </m:r>
+      </m:oMath>
+      <w:r>
+        <w:rPr>
+          <w:b w:val="0"/>
+          <w:i w:val="0"/>
+        </w:rPr>
+        <w:t xml:space="preserve"> — barcha miqyos va tomonlar to'plami, </w:t>
+      </w:r>
+      <m:oMath>
+        <m:sSubSup>
+          <m:e>
+            <m:r>
+              <m:t xml:space="preserve">m</m:t>
+            </m:r>
+          </m:e>
+          <m:sub>
+            <m:r>
+              <m:t xml:space="preserve">v</m:t>
+            </m:r>
+          </m:sub>
+          <m:sup>
+            <m:r>
+              <m:rPr>
+                <m:sty m:val="p"/>
+              </m:rPr>
+              <m:t xml:space="preserve">(</m:t>
+            </m:r>
+            <m:r>
+              <m:t xml:space="preserve">s</m:t>
+            </m:r>
+            <m:r>
+              <m:rPr>
+                <m:sty m:val="p"/>
+              </m:rPr>
+              <m:t xml:space="preserve">)</m:t>
+            </m:r>
+          </m:sup>
+        </m:sSubSup>
+      </m:oMath>
+      <w:r>
+        <w:rPr>
+          <w:b w:val="0"/>
+          <w:i w:val="0"/>
+        </w:rPr>
+        <w:t xml:space="preserve"> esa asosiy haqiqat (ground-truth) shikastlanish niqobidan olingan maqsadli xarita.</w:t>
       </w:r>
     </w:p>
     <w:p>
@@ -4976,7 +5734,34 @@
           <w:b w:val="0"/>
           <w:i w:val="0"/>
         </w:rPr>
-        <w:t>BCA blokining hisoblash tuzilmasini batafsil ko'rib chiqamiz. Har bir miqyos $s$ da xususiyat xaritalari $1 \times 1$ konvolyutsiyalar orqali so'rov, kalit va qiymat fazolariga proyeksiyalanadi. O'zaro e'tibor kontralateral juftlik bo'yicha hisoblanadi: chap ko'rinishning har bir fazoviy pozitsiyasi o'ng (akslangan) ko'rinishning barcha pozitsiyalariga e'tibor beradi va eng o'xshash kontralateral sohani topadi. Bu mexanizm radiolog chap va o'ng ko'krakni vizual qiyoslab, mos kelmaydigan (asimmetrik) sohalarni qidirishini bevosita modellashtiradi.</w:t>
+        <w:t xml:space="preserve">BCA blokining hisoblash tuzilmasini batafsil ko'rib chiqamiz. Har bir miqyos </w:t>
+      </w:r>
+      <m:oMath>
+        <m:r>
+          <m:t xml:space="preserve">s</m:t>
+        </m:r>
+      </m:oMath>
+      <w:r>
+        <w:rPr>
+          <w:b w:val="0"/>
+          <w:i w:val="0"/>
+        </w:rPr>
+        <w:t xml:space="preserve"> da xususiyat xaritalari </w:t>
+      </w:r>
+      <m:oMath>
+        <m:r>
+          <m:rPr>
+            <m:sty m:val="p"/>
+          </m:rPr>
+          <m:t xml:space="preserve">1 × 1</m:t>
+        </m:r>
+      </m:oMath>
+      <w:r>
+        <w:rPr>
+          <w:b w:val="0"/>
+          <w:i w:val="0"/>
+        </w:rPr>
+        <w:t xml:space="preserve"> konvolyutsiyalar orqali so'rov, kalit va qiymat fazolariga proyeksiyalanadi. O'zaro e'tibor kontralateral juftlik bo'yicha hisoblanadi: chap ko'rinishning har bir fazoviy pozitsiyasi o'ng (akslangan) ko'rinishning barcha pozitsiyalariga e'tibor beradi va eng o'xshash kontralateral sohani topadi. Bu mexanizm radiolog chap va o'ng ko'krakni vizual qiyoslab, mos kelmaydigan (asimmetrik) sohalarni qidirishini bevosita modellashtiradi.</w:t>
       </w:r>
     </w:p>
     <w:p>
@@ -4989,7 +5774,25 @@
           <w:b w:val="0"/>
           <w:i w:val="0"/>
         </w:rPr>
-        <w:t>O'ng ko'rinishni ufqiy akslantirish — anatomik tenglashtirish uchun zarur, chunki chap va o'ng ko'krak oyna-simmetrik joylashgan. Akslantirishsiz o'zaro e'tibor noto'g'ri anatomik mos kelishlarni hisoblar edi. E'tibor barcha bazaviy miqyoslarda (odatda $S=3$) mustaqil ravishda qo'llaniladi, bu turli o'lchamdagi asimmetriyalarni — mayda mikrokalsifikatsiya guruhidan yirik massagacha — qamrab oladi. Hisoblash murakkabligini cheklash uchun e'tibor past miqyoslarda (kichik fazoviy o'lcham) samaraliroq bo'ladi.</w:t>
+        <w:t xml:space="preserve">O'ng ko'rinishni ufqiy akslantirish — anatomik tenglashtirish uchun zarur, chunki chap va o'ng ko'krak oyna-simmetrik joylashgan. Akslantirishsiz o'zaro e'tibor noto'g'ri anatomik mos kelishlarni hisoblar edi. E'tibor barcha bazaviy miqyoslarda (odatda </w:t>
+      </w:r>
+      <m:oMath>
+        <m:r>
+          <m:t xml:space="preserve">S</m:t>
+        </m:r>
+        <m:r>
+          <m:rPr>
+            <m:sty m:val="p"/>
+          </m:rPr>
+          <m:t xml:space="preserve">=3</m:t>
+        </m:r>
+      </m:oMath>
+      <w:r>
+        <w:rPr>
+          <w:b w:val="0"/>
+          <w:i w:val="0"/>
+        </w:rPr>
+        <w:t>) mustaqil ravishda qo'llaniladi, bu turli o'lchamdagi asimmetriyalarni — mayda mikrokalsifikatsiya guruhidan yirik massagacha — qamrab oladi. Hisoblash murakkabligini cheklash uchun e'tibor past miqyoslarda (kichik fazoviy o'lcham) samaraliroq bo'ladi.</w:t>
       </w:r>
     </w:p>
     <w:p>
@@ -4997,12 +5800,119 @@
         <w:ind w:firstLine="567"/>
         <w:jc w:val="both"/>
       </w:pPr>
+      <m:oMath>
+        <m:r>
+          <m:t xml:space="preserve">α</m:t>
+        </m:r>
+      </m:oMath>
       <w:r>
         <w:rPr>
           <w:b w:val="0"/>
           <w:i w:val="0"/>
         </w:rPr>
-        <w:t>$\alpha$ koeffitsiyentining nolga initsializatsiyasi muhim nazariy xususiyatga ega. (2.2) ifodadan ko'rinadiki, $\alpha=0$ da $F'_L = F_L$, ya'ni oldinga o'tish bazaviy modelga aynan teng. Biroq (2.9) gradiyenti $\alpha=0$ da ham nol emas, chunki u $\Delta F$ ga proporsional. Demak, model oldindan o'rgatilgan og'irliklardan boshlab, BCA modulini asta-sekin "yoqadi" — bu beqaror sakrashlarsiz silliq sozlashni ta'minlaydi. Bu xossa ResNet'dagi qoldiq bog'lanishlar va ba'zi e'tibor modullaridagi nolga initsializatsiya g'oyalariga mos keladi.</w:t>
+        <w:t xml:space="preserve"> koeffitsiyentining nolga initsializatsiyasi muhim nazariy xususiyatga ega. (2.2) ifodadan ko'rinadiki, </w:t>
+      </w:r>
+      <m:oMath>
+        <m:r>
+          <m:t xml:space="preserve">α</m:t>
+        </m:r>
+        <m:r>
+          <m:rPr>
+            <m:sty m:val="p"/>
+          </m:rPr>
+          <m:t xml:space="preserve">=0</m:t>
+        </m:r>
+      </m:oMath>
+      <w:r>
+        <w:rPr>
+          <w:b w:val="0"/>
+          <w:i w:val="0"/>
+        </w:rPr>
+        <w:t xml:space="preserve"> da </w:t>
+      </w:r>
+      <m:oMath>
+        <m:r>
+          <m:t xml:space="preserve">F</m:t>
+        </m:r>
+        <m:sSub>
+          <m:e>
+            <m:r>
+              <m:rPr>
+                <m:sty m:val="p"/>
+              </m:rPr>
+              <m:t xml:space="preserve">'</m:t>
+            </m:r>
+          </m:e>
+          <m:sub>
+            <m:r>
+              <m:t xml:space="preserve">L</m:t>
+            </m:r>
+          </m:sub>
+        </m:sSub>
+        <m:r>
+          <m:rPr>
+            <m:sty m:val="p"/>
+          </m:rPr>
+          <m:t xml:space="preserve"> = </m:t>
+        </m:r>
+        <m:sSub>
+          <m:e>
+            <m:r>
+              <m:t xml:space="preserve">F</m:t>
+            </m:r>
+          </m:e>
+          <m:sub>
+            <m:r>
+              <m:t xml:space="preserve">L</m:t>
+            </m:r>
+          </m:sub>
+        </m:sSub>
+      </m:oMath>
+      <w:r>
+        <w:rPr>
+          <w:b w:val="0"/>
+          <w:i w:val="0"/>
+        </w:rPr>
+        <w:t xml:space="preserve">, ya'ni oldinga o'tish bazaviy modelga aynan teng. Biroq (2.9) gradiyenti </w:t>
+      </w:r>
+      <m:oMath>
+        <m:r>
+          <m:t xml:space="preserve">α</m:t>
+        </m:r>
+        <m:r>
+          <m:rPr>
+            <m:sty m:val="p"/>
+          </m:rPr>
+          <m:t xml:space="preserve">=0</m:t>
+        </m:r>
+      </m:oMath>
+      <w:r>
+        <w:rPr>
+          <w:b w:val="0"/>
+          <w:i w:val="0"/>
+        </w:rPr>
+        <w:t xml:space="preserve"> da ham nol emas, chunki u </w:t>
+      </w:r>
+      <m:oMath>
+        <m:r>
+          <m:t xml:space="preserve">Δ</m:t>
+        </m:r>
+        <m:r>
+          <m:rPr>
+            <m:sty m:val="p"/>
+          </m:rPr>
+          <m:t xml:space="preserve"> </m:t>
+        </m:r>
+        <m:r>
+          <m:t xml:space="preserve">F</m:t>
+        </m:r>
+      </m:oMath>
+      <w:r>
+        <w:rPr>
+          <w:b w:val="0"/>
+          <w:i w:val="0"/>
+        </w:rPr>
+        <w:t xml:space="preserve"> ga proporsional. Demak, model oldindan o'rgatilgan og'irliklardan boshlab, BCA modulini asta-sekin "yoqadi" — bu beqaror sakrashlarsiz silliq sozlashni ta'minlaydi. Bu xossa ResNet'dagi qoldiq bog'lanishlar va ba'zi e'tibor modullaridagi nolga initsializatsiya g'oyalariga mos keladi.</w:t>
       </w:r>
     </w:p>
     <w:p>
@@ -5174,7 +6084,70 @@
           <w:b w:val="0"/>
           <w:i w:val="0"/>
         </w:rPr>
-        <w:t xml:space="preserve"> modeli qo'llaniladi. Yagona skalyar chiqish $f$ va $K-1$ ta ostona $\{\theta_k\}$ yordamida ordinal yo'qotish ikkilik kross-entropiyalar yig'indisi sifatida ifodalanadi:</w:t>
+        <w:t xml:space="preserve"> modeli qo'llaniladi. Yagona skalyar chiqish </w:t>
+      </w:r>
+      <m:oMath>
+        <m:r>
+          <m:t xml:space="preserve">f</m:t>
+        </m:r>
+      </m:oMath>
+      <w:r>
+        <w:rPr>
+          <w:b w:val="0"/>
+          <w:i w:val="0"/>
+        </w:rPr>
+        <w:t xml:space="preserve"> va </w:t>
+      </w:r>
+      <m:oMath>
+        <m:r>
+          <m:t xml:space="preserve">K</m:t>
+        </m:r>
+        <m:r>
+          <m:rPr>
+            <m:sty m:val="p"/>
+          </m:rPr>
+          <m:t xml:space="preserve">-1</m:t>
+        </m:r>
+      </m:oMath>
+      <w:r>
+        <w:rPr>
+          <w:b w:val="0"/>
+          <w:i w:val="0"/>
+        </w:rPr>
+        <w:t xml:space="preserve"> ta ostona </w:t>
+      </w:r>
+      <m:oMath>
+        <m:r>
+          <m:rPr>
+            <m:sty m:val="p"/>
+          </m:rPr>
+          <m:t xml:space="preserve">{</m:t>
+        </m:r>
+        <m:sSub>
+          <m:e>
+            <m:r>
+              <m:t xml:space="preserve">θ</m:t>
+            </m:r>
+          </m:e>
+          <m:sub>
+            <m:r>
+              <m:t xml:space="preserve">k</m:t>
+            </m:r>
+          </m:sub>
+        </m:sSub>
+        <m:r>
+          <m:rPr>
+            <m:sty m:val="p"/>
+          </m:rPr>
+          <m:t xml:space="preserve">}</m:t>
+        </m:r>
+      </m:oMath>
+      <w:r>
+        <w:rPr>
+          <w:b w:val="0"/>
+          <w:i w:val="0"/>
+        </w:rPr>
+        <w:t xml:space="preserve"> yordamida ordinal yo'qotish ikkilik kross-entropiyalar yig'indisi sifatida ifodalanadi:</w:t>
       </w:r>
     </w:p>
     <w:p>
@@ -5232,7 +6205,151 @@
           <w:b w:val="0"/>
           <w:i w:val="0"/>
         </w:rPr>
-        <w:t>bu yerda $t_k = \mathbf{1}(y \leq k)$ — kumulyativ maqsad indikatori. Ostonalarning qat'iy monotonligini ($\theta_0 &lt; \theta_1 &lt; \dots$) kafolatlash uchun ular cheklanmagan $\tau_j$ parametrlardan $\mathrm{softplus}$ orqali parametrlanadi:</w:t>
+        <w:t xml:space="preserve">bu yerda </w:t>
+      </w:r>
+      <m:oMath>
+        <m:sSub>
+          <m:e>
+            <m:r>
+              <m:t xml:space="preserve">t</m:t>
+            </m:r>
+          </m:e>
+          <m:sub>
+            <m:r>
+              <m:t xml:space="preserve">k</m:t>
+            </m:r>
+          </m:sub>
+        </m:sSub>
+        <m:r>
+          <m:rPr>
+            <m:sty m:val="p"/>
+          </m:rPr>
+          <m:t xml:space="preserve"> = </m:t>
+        </m:r>
+        <m:r>
+          <m:rPr>
+            <m:sty m:val="b"/>
+          </m:rPr>
+          <m:t xml:space="preserve">1</m:t>
+        </m:r>
+        <m:r>
+          <m:rPr>
+            <m:sty m:val="p"/>
+          </m:rPr>
+          <m:t xml:space="preserve">(</m:t>
+        </m:r>
+        <m:r>
+          <m:t xml:space="preserve">y</m:t>
+        </m:r>
+        <m:r>
+          <m:rPr>
+            <m:sty m:val="p"/>
+          </m:rPr>
+          <m:t xml:space="preserve"> ≤ </m:t>
+        </m:r>
+        <m:r>
+          <m:t xml:space="preserve">k</m:t>
+        </m:r>
+        <m:r>
+          <m:rPr>
+            <m:sty m:val="p"/>
+          </m:rPr>
+          <m:t xml:space="preserve">)</m:t>
+        </m:r>
+      </m:oMath>
+      <w:r>
+        <w:rPr>
+          <w:b w:val="0"/>
+          <w:i w:val="0"/>
+        </w:rPr>
+        <w:t xml:space="preserve"> — kumulyativ maqsad indikatori. Ostonalarning qat'iy monotonligini (</w:t>
+      </w:r>
+      <m:oMath>
+        <m:sSub>
+          <m:e>
+            <m:r>
+              <m:t xml:space="preserve">θ</m:t>
+            </m:r>
+          </m:e>
+          <m:sub>
+            <m:r>
+              <m:rPr>
+                <m:sty m:val="p"/>
+              </m:rPr>
+              <m:t xml:space="preserve">0</m:t>
+            </m:r>
+          </m:sub>
+        </m:sSub>
+        <m:r>
+          <m:rPr>
+            <m:sty m:val="p"/>
+          </m:rPr>
+          <m:t xml:space="preserve"> &lt; </m:t>
+        </m:r>
+        <m:sSub>
+          <m:e>
+            <m:r>
+              <m:t xml:space="preserve">θ</m:t>
+            </m:r>
+          </m:e>
+          <m:sub>
+            <m:r>
+              <m:rPr>
+                <m:sty m:val="p"/>
+              </m:rPr>
+              <m:t xml:space="preserve">1</m:t>
+            </m:r>
+          </m:sub>
+        </m:sSub>
+        <m:r>
+          <m:rPr>
+            <m:sty m:val="p"/>
+          </m:rPr>
+          <m:t xml:space="preserve"> &lt; …</m:t>
+        </m:r>
+      </m:oMath>
+      <w:r>
+        <w:rPr>
+          <w:b w:val="0"/>
+          <w:i w:val="0"/>
+        </w:rPr>
+        <w:t xml:space="preserve">) kafolatlash uchun ular cheklanmagan </w:t>
+      </w:r>
+      <m:oMath>
+        <m:sSub>
+          <m:e>
+            <m:r>
+              <m:t xml:space="preserve">τ</m:t>
+            </m:r>
+          </m:e>
+          <m:sub>
+            <m:r>
+              <m:t xml:space="preserve">j</m:t>
+            </m:r>
+          </m:sub>
+        </m:sSub>
+      </m:oMath>
+      <w:r>
+        <w:rPr>
+          <w:b w:val="0"/>
+          <w:i w:val="0"/>
+        </w:rPr>
+        <w:t xml:space="preserve"> parametrlardan </w:t>
+      </w:r>
+      <m:oMath>
+        <m:r>
+          <m:rPr>
+            <m:sty m:val="p"/>
+          </m:rPr>
+          <m:t xml:space="preserve">softplus</m:t>
+        </m:r>
+      </m:oMath>
+      <w:r>
+        <w:rPr>
+          <w:b w:val="0"/>
+          <w:i w:val="0"/>
+        </w:rPr>
+        <w:t xml:space="preserve"> orqali parametrlanadi:</w:t>
       </w:r>
     </w:p>
     <w:p>
@@ -5290,7 +6407,28 @@
           <w:b w:val="0"/>
           <w:i w:val="0"/>
         </w:rPr>
-        <w:t>Bu parametrlash qo'shimcha jarimasiz monotonlikni ta'minlaydi va qo'shni BI-RADS darajalarining yagona qaror chegarasiga yig'ilishini oldini oladi. Ostonalar ketma-ketligining $\tau_j$ bo'yicha Yakobian matritsasi quyi uchburchakli bo'lib, gradiyentlar faqat tartib bo'yicha "oldinga" oqishini ko'rsatadi:</w:t>
+        <w:t xml:space="preserve">Bu parametrlash qo'shimcha jarimasiz monotonlikni ta'minlaydi va qo'shni BI-RADS darajalarining yagona qaror chegarasiga yig'ilishini oldini oladi. Ostonalar ketma-ketligining </w:t>
+      </w:r>
+      <m:oMath>
+        <m:sSub>
+          <m:e>
+            <m:r>
+              <m:t xml:space="preserve">τ</m:t>
+            </m:r>
+          </m:e>
+          <m:sub>
+            <m:r>
+              <m:t xml:space="preserve">j</m:t>
+            </m:r>
+          </m:sub>
+        </m:sSub>
+      </m:oMath>
+      <w:r>
+        <w:rPr>
+          <w:b w:val="0"/>
+          <w:i w:val="0"/>
+        </w:rPr>
+        <w:t xml:space="preserve"> bo'yicha Yakobian matritsasi quyi uchburchakli bo'lib, gradiyentlar faqat tartib bo'yicha "oldinga" oqishini ko'rsatadi:</w:t>
       </w:r>
     </w:p>
     <w:p>
@@ -5345,23 +6483,29 @@
       </w:pPr>
       <w:r>
         <w:rPr>
+          <w:b/>
+          <w:i w:val="0"/>
+        </w:rPr>
+        <w:t>BCA darvozasi gradiyenti.</w:t>
+      </w:r>
+      <w:r>
+        <w:rPr>
           <w:b w:val="0"/>
           <w:i w:val="0"/>
         </w:rPr>
-      </w:r>
-      <w:r>
-        <w:rPr>
-          <w:b/>
-          <w:i w:val="0"/>
-        </w:rPr>
-        <w:t>BCA darvozasi gradiyenti.</w:t>
-      </w:r>
+        <w:t xml:space="preserve"> Umumiy yo'qotishning </w:t>
+      </w:r>
+      <m:oMath>
+        <m:r>
+          <m:t xml:space="preserve">α</m:t>
+        </m:r>
+      </m:oMath>
       <w:r>
         <w:rPr>
           <w:b w:val="0"/>
           <w:i w:val="0"/>
         </w:rPr>
-        <w:t xml:space="preserve"> Umumiy yo'qotishning $\alpha$ bo'yicha gradiyenti Frobenius ichki ko'paytmasi orqali ifodalanadi:</w:t>
+        <w:t xml:space="preserve"> bo'yicha gradiyenti Frobenius ichki ko'paytmasi orqali ifodalanadi:</w:t>
       </w:r>
     </w:p>
     <w:p>
@@ -5419,7 +6563,46 @@
           <w:b w:val="0"/>
           <w:i w:val="0"/>
         </w:rPr>
-        <w:t>Initsializatsiya paytida $\alpha=0$ bo'lsa-da, bu gradiyent nolga teng emas — u faqat $\Delta F$ yo'nalishiga bog'liq. Shu sababli optimizator birinchi qadamdanoq ma'noli tushish yo'nalishini oladi, garchi BCA tarmog'i oldinga o'tishda hali ta'sir ko'rsatmasa ham. Bu — oldindan o'rgatilgan tarmoqlarni barqaror sozlash uchun foydali qo'zg'almas nuqta xususiyatidir.</w:t>
+        <w:t xml:space="preserve">Initsializatsiya paytida </w:t>
+      </w:r>
+      <m:oMath>
+        <m:r>
+          <m:t xml:space="preserve">α</m:t>
+        </m:r>
+        <m:r>
+          <m:rPr>
+            <m:sty m:val="p"/>
+          </m:rPr>
+          <m:t xml:space="preserve">=0</m:t>
+        </m:r>
+      </m:oMath>
+      <w:r>
+        <w:rPr>
+          <w:b w:val="0"/>
+          <w:i w:val="0"/>
+        </w:rPr>
+        <w:t xml:space="preserve"> bo'lsa-da, bu gradiyent nolga teng emas — u faqat </w:t>
+      </w:r>
+      <m:oMath>
+        <m:r>
+          <m:t xml:space="preserve">Δ</m:t>
+        </m:r>
+        <m:r>
+          <m:rPr>
+            <m:sty m:val="p"/>
+          </m:rPr>
+          <m:t xml:space="preserve"> </m:t>
+        </m:r>
+        <m:r>
+          <m:t xml:space="preserve">F</m:t>
+        </m:r>
+      </m:oMath>
+      <w:r>
+        <w:rPr>
+          <w:b w:val="0"/>
+          <w:i w:val="0"/>
+        </w:rPr>
+        <w:t xml:space="preserve"> yo'nalishiga bog'liq. Shu sababli optimizator birinchi qadamdanoq ma'noli tushish yo'nalishini oladi, garchi BCA tarmog'i oldinga o'tishda hali ta'sir ko'rsatmasa ham. Bu — oldindan o'rgatilgan tarmoqlarni barqaror sozlash uchun foydali qo'zg'almas nuqta xususiyatidir.</w:t>
       </w:r>
     </w:p>
     <w:p>
@@ -5427,12 +6610,6 @@
         <w:ind w:firstLine="567"/>
         <w:jc w:val="both"/>
       </w:pPr>
-      <w:r>
-        <w:rPr>
-          <w:b w:val="0"/>
-          <w:i w:val="0"/>
-        </w:rPr>
-      </w:r>
       <w:r>
         <w:rPr>
           <w:b/>
@@ -5503,7 +6680,73 @@
           <w:b w:val="0"/>
           <w:i w:val="0"/>
         </w:rPr>
-        <w:t>bu yerda $\lambda_1, \lambda_2, \lambda_3$ — giperparametrlar. Sinf yo'qotishi sifatida kross-entropiya, mikrokalsifikatsiya/massa kabi noyob sinflar uchun fokal yo'qotish (2-bob, (1.7)) qo'llanilishi mumkin:</w:t>
+        <w:t xml:space="preserve">bu yerda </w:t>
+      </w:r>
+      <m:oMath>
+        <m:sSub>
+          <m:e>
+            <m:r>
+              <m:t xml:space="preserve">λ</m:t>
+            </m:r>
+          </m:e>
+          <m:sub>
+            <m:r>
+              <m:rPr>
+                <m:sty m:val="p"/>
+              </m:rPr>
+              <m:t xml:space="preserve">1</m:t>
+            </m:r>
+          </m:sub>
+        </m:sSub>
+        <m:r>
+          <m:rPr>
+            <m:sty m:val="p"/>
+          </m:rPr>
+          <m:t xml:space="preserve">, </m:t>
+        </m:r>
+        <m:sSub>
+          <m:e>
+            <m:r>
+              <m:t xml:space="preserve">λ</m:t>
+            </m:r>
+          </m:e>
+          <m:sub>
+            <m:r>
+              <m:rPr>
+                <m:sty m:val="p"/>
+              </m:rPr>
+              <m:t xml:space="preserve">2</m:t>
+            </m:r>
+          </m:sub>
+        </m:sSub>
+        <m:r>
+          <m:rPr>
+            <m:sty m:val="p"/>
+          </m:rPr>
+          <m:t xml:space="preserve">, </m:t>
+        </m:r>
+        <m:sSub>
+          <m:e>
+            <m:r>
+              <m:t xml:space="preserve">λ</m:t>
+            </m:r>
+          </m:e>
+          <m:sub>
+            <m:r>
+              <m:rPr>
+                <m:sty m:val="p"/>
+              </m:rPr>
+              <m:t xml:space="preserve">3</m:t>
+            </m:r>
+          </m:sub>
+        </m:sSub>
+      </m:oMath>
+      <w:r>
+        <w:rPr>
+          <w:b w:val="0"/>
+          <w:i w:val="0"/>
+        </w:rPr>
+        <w:t xml:space="preserve"> — giperparametrlar. Sinf yo'qotishi sifatida kross-entropiya, mikrokalsifikatsiya/massa kabi noyob sinflar uchun fokal yo'qotish (2-bob, (1.7)) qo'llanilishi mumkin:</w:t>
       </w:r>
     </w:p>
     <w:p>
@@ -5561,7 +6804,100 @@
           <w:b w:val="0"/>
           <w:i w:val="0"/>
         </w:rPr>
-        <w:t xml:space="preserve">Namunaviy realizatsiya (PyTorch, $\texttt{app/models\_arch/bca\_yolo.py}$) BilateralCrossAttention, InterViewConsistency va OrdinalBIRADSHead komponentlarini hamda yuqori darajali BCAYoloHead orkestratorini eksport qiladi. Kanal kengliklari $(C_1,C_2,C_3)=(256,512,512)$ bo'lgan uch miqyosli tarmoq uchun qo'shimcha modullar bazaviy YOLO boshiga taxminan </w:t>
+        <w:t xml:space="preserve">Namunaviy realizatsiya (PyTorch, </w:t>
+      </w:r>
+      <m:oMath>
+        <m:r>
+          <m:rPr>
+            <m:sty m:val="p"/>
+          </m:rPr>
+          <m:t xml:space="preserve">app/models_arch/bca_yolo.py</m:t>
+        </m:r>
+      </m:oMath>
+      <w:r>
+        <w:rPr>
+          <w:b w:val="0"/>
+          <w:i w:val="0"/>
+        </w:rPr>
+        <w:t xml:space="preserve">) BilateralCrossAttention, InterViewConsistency va OrdinalBIRADSHead komponentlarini hamda yuqori darajali BCAYoloHead orkestratorini eksport qiladi. Kanal kengliklari </w:t>
+      </w:r>
+      <m:oMath>
+        <m:r>
+          <m:rPr>
+            <m:sty m:val="p"/>
+          </m:rPr>
+          <m:t xml:space="preserve">(</m:t>
+        </m:r>
+        <m:sSub>
+          <m:e>
+            <m:r>
+              <m:t xml:space="preserve">C</m:t>
+            </m:r>
+          </m:e>
+          <m:sub>
+            <m:r>
+              <m:rPr>
+                <m:sty m:val="p"/>
+              </m:rPr>
+              <m:t xml:space="preserve">1</m:t>
+            </m:r>
+          </m:sub>
+        </m:sSub>
+        <m:r>
+          <m:rPr>
+            <m:sty m:val="p"/>
+          </m:rPr>
+          <m:t xml:space="preserve">,</m:t>
+        </m:r>
+        <m:sSub>
+          <m:e>
+            <m:r>
+              <m:t xml:space="preserve">C</m:t>
+            </m:r>
+          </m:e>
+          <m:sub>
+            <m:r>
+              <m:rPr>
+                <m:sty m:val="p"/>
+              </m:rPr>
+              <m:t xml:space="preserve">2</m:t>
+            </m:r>
+          </m:sub>
+        </m:sSub>
+        <m:r>
+          <m:rPr>
+            <m:sty m:val="p"/>
+          </m:rPr>
+          <m:t xml:space="preserve">,</m:t>
+        </m:r>
+        <m:sSub>
+          <m:e>
+            <m:r>
+              <m:t xml:space="preserve">C</m:t>
+            </m:r>
+          </m:e>
+          <m:sub>
+            <m:r>
+              <m:rPr>
+                <m:sty m:val="p"/>
+              </m:rPr>
+              <m:t xml:space="preserve">3</m:t>
+            </m:r>
+          </m:sub>
+        </m:sSub>
+        <m:r>
+          <m:rPr>
+            <m:sty m:val="p"/>
+          </m:rPr>
+          <m:t xml:space="preserve">)=(256,512,512)</m:t>
+        </m:r>
+      </m:oMath>
+      <w:r>
+        <w:rPr>
+          <w:b w:val="0"/>
+          <w:i w:val="0"/>
+        </w:rPr>
+        <w:t xml:space="preserve"> bo'lgan uch miqyosli tarmoq uchun qo'shimcha modullar bazaviy YOLO boshiga taxminan </w:t>
       </w:r>
       <w:r>
         <w:rPr>
@@ -5588,7 +6924,391 @@
           <w:b w:val="0"/>
           <w:i w:val="0"/>
         </w:rPr>
-        <w:t>Ordinal kumulyativ modelning kelib chiqishini batafsil ko'rsatamiz. Maqsad $y \in \{0,\dots,K-1\}$ ni $K-1$ ta ikkilik masalaga ajratamiz: har bir $k$ uchun "$y \leq k$mi?" degan savol. Bu savollarning javoblari $t_k = \mathbf{1}(y \leq k)$ tabiiy ravishda monoton: agar $y \leq k$ bo'lsa, $y \leq k+1$ ham o'rinli. Model yagona skalyar $f$ va ostonalar $\theta_k$ orqali $P(y \leq k) = \sigma(\theta_k - f)$ ehtimollikni baholaydi. Ostonalar monotonligi ($\theta_0 &lt; \theta_1 &lt; \dots$) ehtimolliklarning ham monotonligini ($P(y\leq 0) \leq P(y\leq 1) \leq \dots$) kafolatlaydi, bu ordinal tuzilmaning izchilligini ta'minlaydi.</w:t>
+        <w:t xml:space="preserve">Ordinal kumulyativ modelning kelib chiqishini batafsil ko'rsatamiz. Maqsad </w:t>
+      </w:r>
+      <m:oMath>
+        <m:r>
+          <m:t xml:space="preserve">y</m:t>
+        </m:r>
+        <m:r>
+          <m:rPr>
+            <m:sty m:val="p"/>
+          </m:rPr>
+          <m:t xml:space="preserve"> ∈ {0,…,</m:t>
+        </m:r>
+        <m:r>
+          <m:t xml:space="preserve">K</m:t>
+        </m:r>
+        <m:r>
+          <m:rPr>
+            <m:sty m:val="p"/>
+          </m:rPr>
+          <m:t xml:space="preserve">-1}</m:t>
+        </m:r>
+      </m:oMath>
+      <w:r>
+        <w:rPr>
+          <w:b w:val="0"/>
+          <w:i w:val="0"/>
+        </w:rPr>
+        <w:t xml:space="preserve"> ni </w:t>
+      </w:r>
+      <m:oMath>
+        <m:r>
+          <m:t xml:space="preserve">K</m:t>
+        </m:r>
+        <m:r>
+          <m:rPr>
+            <m:sty m:val="p"/>
+          </m:rPr>
+          <m:t xml:space="preserve">-1</m:t>
+        </m:r>
+      </m:oMath>
+      <w:r>
+        <w:rPr>
+          <w:b w:val="0"/>
+          <w:i w:val="0"/>
+        </w:rPr>
+        <w:t xml:space="preserve"> ta ikkilik masalaga ajratamiz: har bir </w:t>
+      </w:r>
+      <m:oMath>
+        <m:r>
+          <m:t xml:space="preserve">k</m:t>
+        </m:r>
+      </m:oMath>
+      <w:r>
+        <w:rPr>
+          <w:b w:val="0"/>
+          <w:i w:val="0"/>
+        </w:rPr>
+        <w:t xml:space="preserve"> uchun "</w:t>
+      </w:r>
+      <m:oMath>
+        <m:r>
+          <m:t xml:space="preserve">y</m:t>
+        </m:r>
+        <m:r>
+          <m:rPr>
+            <m:sty m:val="p"/>
+          </m:rPr>
+          <m:t xml:space="preserve"> ≤ </m:t>
+        </m:r>
+        <m:r>
+          <m:t xml:space="preserve">k</m:t>
+        </m:r>
+      </m:oMath>
+      <w:r>
+        <w:rPr>
+          <w:b w:val="0"/>
+          <w:i w:val="0"/>
+        </w:rPr>
+        <w:t xml:space="preserve">mi?" degan savol. Bu savollarning javoblari </w:t>
+      </w:r>
+      <m:oMath>
+        <m:sSub>
+          <m:e>
+            <m:r>
+              <m:t xml:space="preserve">t</m:t>
+            </m:r>
+          </m:e>
+          <m:sub>
+            <m:r>
+              <m:t xml:space="preserve">k</m:t>
+            </m:r>
+          </m:sub>
+        </m:sSub>
+        <m:r>
+          <m:rPr>
+            <m:sty m:val="p"/>
+          </m:rPr>
+          <m:t xml:space="preserve"> = </m:t>
+        </m:r>
+        <m:r>
+          <m:rPr>
+            <m:sty m:val="b"/>
+          </m:rPr>
+          <m:t xml:space="preserve">1</m:t>
+        </m:r>
+        <m:r>
+          <m:rPr>
+            <m:sty m:val="p"/>
+          </m:rPr>
+          <m:t xml:space="preserve">(</m:t>
+        </m:r>
+        <m:r>
+          <m:t xml:space="preserve">y</m:t>
+        </m:r>
+        <m:r>
+          <m:rPr>
+            <m:sty m:val="p"/>
+          </m:rPr>
+          <m:t xml:space="preserve"> ≤ </m:t>
+        </m:r>
+        <m:r>
+          <m:t xml:space="preserve">k</m:t>
+        </m:r>
+        <m:r>
+          <m:rPr>
+            <m:sty m:val="p"/>
+          </m:rPr>
+          <m:t xml:space="preserve">)</m:t>
+        </m:r>
+      </m:oMath>
+      <w:r>
+        <w:rPr>
+          <w:b w:val="0"/>
+          <w:i w:val="0"/>
+        </w:rPr>
+        <w:t xml:space="preserve"> tabiiy ravishda monoton: agar </w:t>
+      </w:r>
+      <m:oMath>
+        <m:r>
+          <m:t xml:space="preserve">y</m:t>
+        </m:r>
+        <m:r>
+          <m:rPr>
+            <m:sty m:val="p"/>
+          </m:rPr>
+          <m:t xml:space="preserve"> ≤ </m:t>
+        </m:r>
+        <m:r>
+          <m:t xml:space="preserve">k</m:t>
+        </m:r>
+      </m:oMath>
+      <w:r>
+        <w:rPr>
+          <w:b w:val="0"/>
+          <w:i w:val="0"/>
+        </w:rPr>
+        <w:t xml:space="preserve"> bo'lsa, </w:t>
+      </w:r>
+      <m:oMath>
+        <m:r>
+          <m:t xml:space="preserve">y</m:t>
+        </m:r>
+        <m:r>
+          <m:rPr>
+            <m:sty m:val="p"/>
+          </m:rPr>
+          <m:t xml:space="preserve"> ≤ </m:t>
+        </m:r>
+        <m:r>
+          <m:t xml:space="preserve">k</m:t>
+        </m:r>
+        <m:r>
+          <m:rPr>
+            <m:sty m:val="p"/>
+          </m:rPr>
+          <m:t xml:space="preserve">+1</m:t>
+        </m:r>
+      </m:oMath>
+      <w:r>
+        <w:rPr>
+          <w:b w:val="0"/>
+          <w:i w:val="0"/>
+        </w:rPr>
+        <w:t xml:space="preserve"> ham o'rinli. Model yagona skalyar </w:t>
+      </w:r>
+      <m:oMath>
+        <m:r>
+          <m:t xml:space="preserve">f</m:t>
+        </m:r>
+      </m:oMath>
+      <w:r>
+        <w:rPr>
+          <w:b w:val="0"/>
+          <w:i w:val="0"/>
+        </w:rPr>
+        <w:t xml:space="preserve"> va ostonalar </w:t>
+      </w:r>
+      <m:oMath>
+        <m:sSub>
+          <m:e>
+            <m:r>
+              <m:t xml:space="preserve">θ</m:t>
+            </m:r>
+          </m:e>
+          <m:sub>
+            <m:r>
+              <m:t xml:space="preserve">k</m:t>
+            </m:r>
+          </m:sub>
+        </m:sSub>
+      </m:oMath>
+      <w:r>
+        <w:rPr>
+          <w:b w:val="0"/>
+          <w:i w:val="0"/>
+        </w:rPr>
+        <w:t xml:space="preserve"> orqali </w:t>
+      </w:r>
+      <m:oMath>
+        <m:r>
+          <m:t xml:space="preserve">P</m:t>
+        </m:r>
+        <m:r>
+          <m:rPr>
+            <m:sty m:val="p"/>
+          </m:rPr>
+          <m:t xml:space="preserve">(</m:t>
+        </m:r>
+        <m:r>
+          <m:t xml:space="preserve">y</m:t>
+        </m:r>
+        <m:r>
+          <m:rPr>
+            <m:sty m:val="p"/>
+          </m:rPr>
+          <m:t xml:space="preserve"> ≤ </m:t>
+        </m:r>
+        <m:r>
+          <m:t xml:space="preserve">k</m:t>
+        </m:r>
+        <m:r>
+          <m:rPr>
+            <m:sty m:val="p"/>
+          </m:rPr>
+          <m:t xml:space="preserve">) = </m:t>
+        </m:r>
+        <m:r>
+          <m:t xml:space="preserve">σ</m:t>
+        </m:r>
+        <m:r>
+          <m:rPr>
+            <m:sty m:val="p"/>
+          </m:rPr>
+          <m:t xml:space="preserve">(</m:t>
+        </m:r>
+        <m:sSub>
+          <m:e>
+            <m:r>
+              <m:t xml:space="preserve">θ</m:t>
+            </m:r>
+          </m:e>
+          <m:sub>
+            <m:r>
+              <m:t xml:space="preserve">k</m:t>
+            </m:r>
+          </m:sub>
+        </m:sSub>
+        <m:r>
+          <m:rPr>
+            <m:sty m:val="p"/>
+          </m:rPr>
+          <m:t xml:space="preserve"> - </m:t>
+        </m:r>
+        <m:r>
+          <m:t xml:space="preserve">f</m:t>
+        </m:r>
+        <m:r>
+          <m:rPr>
+            <m:sty m:val="p"/>
+          </m:rPr>
+          <m:t xml:space="preserve">)</m:t>
+        </m:r>
+      </m:oMath>
+      <w:r>
+        <w:rPr>
+          <w:b w:val="0"/>
+          <w:i w:val="0"/>
+        </w:rPr>
+        <w:t xml:space="preserve"> ehtimollikni baholaydi. Ostonalar monotonligi (</w:t>
+      </w:r>
+      <m:oMath>
+        <m:sSub>
+          <m:e>
+            <m:r>
+              <m:t xml:space="preserve">θ</m:t>
+            </m:r>
+          </m:e>
+          <m:sub>
+            <m:r>
+              <m:rPr>
+                <m:sty m:val="p"/>
+              </m:rPr>
+              <m:t xml:space="preserve">0</m:t>
+            </m:r>
+          </m:sub>
+        </m:sSub>
+        <m:r>
+          <m:rPr>
+            <m:sty m:val="p"/>
+          </m:rPr>
+          <m:t xml:space="preserve"> &lt; </m:t>
+        </m:r>
+        <m:sSub>
+          <m:e>
+            <m:r>
+              <m:t xml:space="preserve">θ</m:t>
+            </m:r>
+          </m:e>
+          <m:sub>
+            <m:r>
+              <m:rPr>
+                <m:sty m:val="p"/>
+              </m:rPr>
+              <m:t xml:space="preserve">1</m:t>
+            </m:r>
+          </m:sub>
+        </m:sSub>
+        <m:r>
+          <m:rPr>
+            <m:sty m:val="p"/>
+          </m:rPr>
+          <m:t xml:space="preserve"> &lt; …</m:t>
+        </m:r>
+      </m:oMath>
+      <w:r>
+        <w:rPr>
+          <w:b w:val="0"/>
+          <w:i w:val="0"/>
+        </w:rPr>
+        <w:t>) ehtimolliklarning ham monotonligini (</w:t>
+      </w:r>
+      <m:oMath>
+        <m:r>
+          <m:t xml:space="preserve">P</m:t>
+        </m:r>
+        <m:r>
+          <m:rPr>
+            <m:sty m:val="p"/>
+          </m:rPr>
+          <m:t xml:space="preserve">(</m:t>
+        </m:r>
+        <m:r>
+          <m:t xml:space="preserve">y</m:t>
+        </m:r>
+        <m:r>
+          <m:rPr>
+            <m:sty m:val="p"/>
+          </m:rPr>
+          <m:t xml:space="preserve">≤ 0) ≤ </m:t>
+        </m:r>
+        <m:r>
+          <m:t xml:space="preserve">P</m:t>
+        </m:r>
+        <m:r>
+          <m:rPr>
+            <m:sty m:val="p"/>
+          </m:rPr>
+          <m:t xml:space="preserve">(</m:t>
+        </m:r>
+        <m:r>
+          <m:t xml:space="preserve">y</m:t>
+        </m:r>
+        <m:r>
+          <m:rPr>
+            <m:sty m:val="p"/>
+          </m:rPr>
+          <m:t xml:space="preserve">≤ 1) ≤ …</m:t>
+        </m:r>
+      </m:oMath>
+      <w:r>
+        <w:rPr>
+          <w:b w:val="0"/>
+          <w:i w:val="0"/>
+        </w:rPr>
+        <w:t>) kafolatlaydi, bu ordinal tuzilmaning izchilligini ta'minlaydi.</w:t>
       </w:r>
     </w:p>
     <w:p>
@@ -5601,7 +7321,49 @@
           <w:b w:val="0"/>
           <w:i w:val="0"/>
         </w:rPr>
-        <w:t>Bu yondashuvning nominal kross-entropiyadan ustunligi shundaki, u xatoning kattaligini hisobga oladi: BI-RADS 5 ni 1 deb baholash, 5 ni 4 deb baholashdan ko'ra ko'proq jazolanadi, chunki ko'proq ikkilik chegaralar buziladi. Bu klinik jihatdan to'g'ri — uzoq toifalardagi xato ancha xavfli. (2.8) Yakobian matritsasi quyi uchburchakli bo'lgani uchun, $\tau_j$ parametrining yangilanishi $\theta_j$ dan boshlab barcha keyingi ostonalarni suradi; bu ketma-ket bog'liqlik ikki qo'shni qaror chegarasining yagona nuqtaga yig'ilishini oldini oladi va shu orqali qo'shni BI-RADS toifalarining ajralishini saqlaydi.</w:t>
+        <w:t xml:space="preserve">Bu yondashuvning nominal kross-entropiyadan ustunligi shundaki, u xatoning kattaligini hisobga oladi: BI-RADS 5 ni 1 deb baholash, 5 ni 4 deb baholashdan ko'ra ko'proq jazolanadi, chunki ko'proq ikkilik chegaralar buziladi. Bu klinik jihatdan to'g'ri — uzoq toifalardagi xato ancha xavfli. (2.8) Yakobian matritsasi quyi uchburchakli bo'lgani uchun, </w:t>
+      </w:r>
+      <m:oMath>
+        <m:sSub>
+          <m:e>
+            <m:r>
+              <m:t xml:space="preserve">τ</m:t>
+            </m:r>
+          </m:e>
+          <m:sub>
+            <m:r>
+              <m:t xml:space="preserve">j</m:t>
+            </m:r>
+          </m:sub>
+        </m:sSub>
+      </m:oMath>
+      <w:r>
+        <w:rPr>
+          <w:b w:val="0"/>
+          <w:i w:val="0"/>
+        </w:rPr>
+        <w:t xml:space="preserve"> parametrining yangilanishi </w:t>
+      </w:r>
+      <m:oMath>
+        <m:sSub>
+          <m:e>
+            <m:r>
+              <m:t xml:space="preserve">θ</m:t>
+            </m:r>
+          </m:e>
+          <m:sub>
+            <m:r>
+              <m:t xml:space="preserve">j</m:t>
+            </m:r>
+          </m:sub>
+        </m:sSub>
+      </m:oMath>
+      <w:r>
+        <w:rPr>
+          <w:b w:val="0"/>
+          <w:i w:val="0"/>
+        </w:rPr>
+        <w:t xml:space="preserve"> dan boshlab barcha keyingi ostonalarni suradi; bu ketma-ket bog'liqlik ikki qo'shni qaror chegarasining yagona nuqtaga yig'ilishini oldini oladi va shu orqali qo'shni BI-RADS toifalarining ajralishini saqlaydi.</w:t>
       </w:r>
     </w:p>
     <w:p>
@@ -5635,7 +7397,61 @@
           <w:b w:val="0"/>
           <w:i w:val="0"/>
         </w:rPr>
-        <w:t>Modelning izohlanuvchanligini oshirish uchun chuqur tasvirlovchilar radiomik belgilar bilan birlashtiriladi (gibrid yondashuv). Aniqlangan o'choq sohasidan birinchi tartib statistikalar, shakl belgilari va GLCM teksturasi (kontrast, energiya, entropiya, gomogenlik, korrelyatsiya — (1.10), (1.11)) hisoblanadi. Chuqur xususiyat vektori $f_{deep}$ va radiomik vektor $f_{radiomic}$ konkatenatsiya orqali birlashtirilib, to'liq bog'langan qatlam $\phi$ va tasniflagich orqali ishlanadi:</w:t>
+        <w:t xml:space="preserve">Modelning izohlanuvchanligini oshirish uchun chuqur tasvirlovchilar radiomik belgilar bilan birlashtiriladi (gibrid yondashuv). Aniqlangan o'choq sohasidan birinchi tartib statistikalar, shakl belgilari va GLCM teksturasi (kontrast, energiya, entropiya, gomogenlik, korrelyatsiya — (1.10), (1.11)) hisoblanadi. Chuqur xususiyat vektori </w:t>
+      </w:r>
+      <m:oMath>
+        <m:sSub>
+          <m:e>
+            <m:r>
+              <m:t xml:space="preserve">f</m:t>
+            </m:r>
+          </m:e>
+          <m:sub>
+            <m:r>
+              <m:t xml:space="preserve">deep</m:t>
+            </m:r>
+          </m:sub>
+        </m:sSub>
+      </m:oMath>
+      <w:r>
+        <w:rPr>
+          <w:b w:val="0"/>
+          <w:i w:val="0"/>
+        </w:rPr>
+        <w:t xml:space="preserve"> va radiomik vektor </w:t>
+      </w:r>
+      <m:oMath>
+        <m:sSub>
+          <m:e>
+            <m:r>
+              <m:t xml:space="preserve">f</m:t>
+            </m:r>
+          </m:e>
+          <m:sub>
+            <m:r>
+              <m:t xml:space="preserve">radiomic</m:t>
+            </m:r>
+          </m:sub>
+        </m:sSub>
+      </m:oMath>
+      <w:r>
+        <w:rPr>
+          <w:b w:val="0"/>
+          <w:i w:val="0"/>
+        </w:rPr>
+        <w:t xml:space="preserve"> konkatenatsiya orqali birlashtirilib, to'liq bog'langan qatlam </w:t>
+      </w:r>
+      <m:oMath>
+        <m:r>
+          <m:t xml:space="preserve">φ</m:t>
+        </m:r>
+      </m:oMath>
+      <w:r>
+        <w:rPr>
+          <w:b w:val="0"/>
+          <w:i w:val="0"/>
+        </w:rPr>
+        <w:t xml:space="preserve"> va tasniflagich orqali ishlanadi:</w:t>
       </w:r>
     </w:p>
     <w:p>
@@ -5728,7 +7544,31 @@
           <w:b w:val="0"/>
           <w:i w:val="0"/>
         </w:rPr>
-        <w:t xml:space="preserve"> (Khamdamov R., Turaqulov Sh.X., 2026) — matn bilan boshqariladigan, FiLM (Feature-wise Linear Modulation) modulyatsiyali FCOS-uslubidagi detektor bo'lib, kam-resursli (low-resource) va ko'p tilli sharoitda mammografik o'choqlarni aniqlashga mo'ljallangan. Matn vektoriga asoslangan $\gamma$ va $\beta$ parametrlari tasvir xususiyatlarini modulyatsiya qiladi:</w:t>
+        <w:t xml:space="preserve"> (Khamdamov R., Turaqulov Sh.X., 2026) — matn bilan boshqariladigan, FiLM (Feature-wise Linear Modulation) modulyatsiyali FCOS-uslubidagi detektor bo'lib, kam-resursli (low-resource) va ko'p tilli sharoitda mammografik o'choqlarni aniqlashga mo'ljallangan. Matn vektoriga asoslangan </w:t>
+      </w:r>
+      <m:oMath>
+        <m:r>
+          <m:t xml:space="preserve">γ</m:t>
+        </m:r>
+      </m:oMath>
+      <w:r>
+        <w:rPr>
+          <w:b w:val="0"/>
+          <w:i w:val="0"/>
+        </w:rPr>
+        <w:t xml:space="preserve"> va </w:t>
+      </w:r>
+      <m:oMath>
+        <m:r>
+          <m:t xml:space="preserve">β</m:t>
+        </m:r>
+      </m:oMath>
+      <w:r>
+        <w:rPr>
+          <w:b w:val="0"/>
+          <w:i w:val="0"/>
+        </w:rPr>
+        <w:t xml:space="preserve"> parametrlari tasvir xususiyatlarini modulyatsiya qiladi:</w:t>
       </w:r>
     </w:p>
     <w:p>
@@ -5786,7 +7626,31 @@
           <w:b w:val="0"/>
           <w:i w:val="0"/>
         </w:rPr>
-        <w:t>FiLM modulyatsiyasi (2.13) matn shartiga asoslanib tasvir xususiyatlarini kanal bo'yicha masshtablaydi ($\gamma$) va siljitadi ($\beta$). Bu mexanizm tasvir va matn modalliklarini chuqur, qatlam darajasida birlashtiradi — oddiy konkatenatsiyaga nisbatan ifoda kuchi yuqori. Klinik kontekstda matn (anamnez, oldingi tashxis) modelni shubhali sohalarga yo'naltirishi yoki ma'lum belgilarning ehtimolligini oshirishi mumkin. Multimodal yondashuvning samaradorligi juftlangan (tasvir+matn) ma'lumot mavjudligiga bog'liq, shu sababli MAMOGRAF tizimi hisobotlarni tasvirlar bilan bog'lash imkonini beradi.</w:t>
+        <w:t>FiLM modulyatsiyasi (2.13) matn shartiga asoslanib tasvir xususiyatlarini kanal bo'yicha masshtablaydi (</w:t>
+      </w:r>
+      <m:oMath>
+        <m:r>
+          <m:t xml:space="preserve">γ</m:t>
+        </m:r>
+      </m:oMath>
+      <w:r>
+        <w:rPr>
+          <w:b w:val="0"/>
+          <w:i w:val="0"/>
+        </w:rPr>
+        <w:t>) va siljitadi (</w:t>
+      </w:r>
+      <m:oMath>
+        <m:r>
+          <m:t xml:space="preserve">β</m:t>
+        </m:r>
+      </m:oMath>
+      <w:r>
+        <w:rPr>
+          <w:b w:val="0"/>
+          <w:i w:val="0"/>
+        </w:rPr>
+        <w:t>). Bu mexanizm tasvir va matn modalliklarini chuqur, qatlam darajasida birlashtiradi — oddiy konkatenatsiyaga nisbatan ifoda kuchi yuqori. Klinik kontekstda matn (anamnez, oldingi tashxis) modelni shubhali sohalarga yo'naltirishi yoki ma'lum belgilarning ehtimolligini oshirishi mumkin. Multimodal yondashuvning samaradorligi juftlangan (tasvir+matn) ma'lumot mavjudligiga bog'liq, shu sababli MAMOGRAF tizimi hisobotlarni tasvirlar bilan bog'lash imkonini beradi.</w:t>
       </w:r>
     </w:p>
     <w:p>
@@ -5794,12 +7658,6 @@
         <w:ind w:firstLine="567"/>
         <w:jc w:val="both"/>
       </w:pPr>
-      <w:r>
-        <w:rPr>
-          <w:b w:val="0"/>
-          <w:i w:val="0"/>
-        </w:rPr>
-      </w:r>
       <w:r>
         <w:rPr>
           <w:b/>
@@ -5914,12 +7772,6 @@
       </w:pPr>
       <w:r>
         <w:rPr>
-          <w:b w:val="0"/>
-          <w:i w:val="0"/>
-        </w:rPr>
-      </w:r>
-      <w:r>
-        <w:rPr>
           <w:b/>
           <w:i w:val="0"/>
         </w:rPr>
@@ -5940,23 +7792,83 @@
       </w:pPr>
       <w:r>
         <w:rPr>
+          <w:b/>
+          <w:i w:val="0"/>
+        </w:rPr>
+        <w:t>Giperparametrlar.</w:t>
+      </w:r>
+      <w:r>
+        <w:rPr>
           <w:b w:val="0"/>
           <w:i w:val="0"/>
         </w:rPr>
-      </w:r>
-      <w:r>
-        <w:rPr>
-          <w:b/>
-          <w:i w:val="0"/>
-        </w:rPr>
-        <w:t>Giperparametrlar.</w:t>
-      </w:r>
+        <w:t xml:space="preserve"> Asosiy giperparametrlar quyidagilarni o'z ichiga oladi: tasvir o'lchami (imgsz, odatda 1024–1536), paket hajmi (batch), epochlar soni, boshlang'ich o'rganish tezligi (lr0), momentum, og'irliklar so'nishi (weight decay), hamda regulyarizatsiya koeffitsiyentlari </w:t>
+      </w:r>
+      <m:oMath>
+        <m:sSub>
+          <m:e>
+            <m:r>
+              <m:t xml:space="preserve">λ</m:t>
+            </m:r>
+          </m:e>
+          <m:sub>
+            <m:r>
+              <m:rPr>
+                <m:sty m:val="p"/>
+              </m:rPr>
+              <m:t xml:space="preserve">1</m:t>
+            </m:r>
+          </m:sub>
+        </m:sSub>
+        <m:r>
+          <m:rPr>
+            <m:sty m:val="p"/>
+          </m:rPr>
+          <m:t xml:space="preserve">, </m:t>
+        </m:r>
+        <m:sSub>
+          <m:e>
+            <m:r>
+              <m:t xml:space="preserve">λ</m:t>
+            </m:r>
+          </m:e>
+          <m:sub>
+            <m:r>
+              <m:rPr>
+                <m:sty m:val="p"/>
+              </m:rPr>
+              <m:t xml:space="preserve">2</m:t>
+            </m:r>
+          </m:sub>
+        </m:sSub>
+        <m:r>
+          <m:rPr>
+            <m:sty m:val="p"/>
+          </m:rPr>
+          <m:t xml:space="preserve">, </m:t>
+        </m:r>
+        <m:sSub>
+          <m:e>
+            <m:r>
+              <m:t xml:space="preserve">λ</m:t>
+            </m:r>
+          </m:e>
+          <m:sub>
+            <m:r>
+              <m:rPr>
+                <m:sty m:val="p"/>
+              </m:rPr>
+              <m:t xml:space="preserve">3</m:t>
+            </m:r>
+          </m:sub>
+        </m:sSub>
+      </m:oMath>
       <w:r>
         <w:rPr>
           <w:b w:val="0"/>
           <w:i w:val="0"/>
         </w:rPr>
-        <w:t xml:space="preserve"> Asosiy giperparametrlar quyidagilarni o'z ichiga oladi: tasvir o'lchami (imgsz, odatda 1024–1536), paket hajmi (batch), epochlar soni, boshlang'ich o'rganish tezligi (lr0), momentum, og'irliklar so'nishi (weight decay), hamda regulyarizatsiya koeffitsiyentlari $\lambda_1, \lambda_2, \lambda_3$. Bu koeffitsiyentlar BCA, IVC va ordinal yo'qotishlarning umumiy yo'qotishdagi nisbiy hissasini boshqaradi va validatsiya to'plamida tanlanadi. MAMOGRAF tizimining Model Studio moduli bu parametrlarning barchasini grafik interfeys orqali sozlash imkonini beradi.</w:t>
+        <w:t>. Bu koeffitsiyentlar BCA, IVC va ordinal yo'qotishlarning umumiy yo'qotishdagi nisbiy hissasini boshqaradi va validatsiya to'plamida tanlanadi. MAMOGRAF tizimining Model Studio moduli bu parametrlarning barchasini grafik interfeys orqali sozlash imkonini beradi.</w:t>
       </w:r>
     </w:p>
     <w:p>
@@ -5966,12 +7878,6 @@
       </w:pPr>
       <w:r>
         <w:rPr>
-          <w:b w:val="0"/>
-          <w:i w:val="0"/>
-        </w:rPr>
-      </w:r>
-      <w:r>
-        <w:rPr>
           <w:b/>
           <w:i w:val="0"/>
         </w:rPr>
@@ -6001,6 +7907,7 @@
       <w:r>
         <w:rPr>
           <w:b w:val="0"/>
+          <w:i w:val="0"/>
         </w:rPr>
         <w:t>Ikki tomonlama o'zaro e'tibor (BCA) bloki kontralateral asimmetriyani nolga initsializatsiyalangan o'rganiluvchi α koeffitsiyenti bilan modelga kiritadi va barqaror sozlashni ta'minlaydi.</w:t>
       </w:r>
@@ -6013,6 +7920,7 @@
       <w:r>
         <w:rPr>
           <w:b w:val="0"/>
+          <w:i w:val="0"/>
         </w:rPr>
         <w:t>Ko'rinishlararo muvofiqlik (IVC) moduli CC va MLO ko'rinishlari o'rtasida obyektlik muvofiqligini global jamlash orqali talab qiladi.</w:t>
       </w:r>
@@ -6025,6 +7933,7 @@
       <w:r>
         <w:rPr>
           <w:b w:val="0"/>
+          <w:i w:val="0"/>
         </w:rPr>
         <w:t>Ordinal regressiya boshi BI-RADS ni softplus orqali parametrlangan qat'iy monoton ostonalar bilan kumulyativ tarzda baholaydi; gradiyent tahlili barqarorlikni tasdiqlaydi.</w:t>
       </w:r>
@@ -6037,6 +7946,7 @@
       <w:r>
         <w:rPr>
           <w:b w:val="0"/>
+          <w:i w:val="0"/>
         </w:rPr>
         <w:t>Kompozit yo'qotish funksiyasi standart YOLO komponentlarini uch yangi regulyarizatsiya bilan birlashtiradi.</w:t>
       </w:r>
@@ -6049,6 +7959,7 @@
       <w:r>
         <w:rPr>
           <w:b w:val="0"/>
+          <w:i w:val="0"/>
         </w:rPr>
         <w:t>Radiomik belgilarni chuqur tasvirlovchilar bilan birlashtirish izohlanuvchanlikni oshiradi; TILLNet va matn tasniflagichi multimodal kengaytmani ta'minlaydi.</w:t>
       </w:r>
@@ -6638,6 +8549,10 @@
         <w:t xml:space="preserve">Eksperiment protokoli. </w:t>
       </w:r>
       <w:r>
+        <w:rPr>
+          <w:b w:val="0"/>
+          <w:i w:val="0"/>
+        </w:rPr>
         <w:t>Ansambl vazni α* faqat o'qitish to'plamidagi moslashgan detektsiyalarda, muvozanatli aniqlik bo'yicha tanlandi; tekshirish to'plami hech qanday tanlovda ishtirok etmadi va faqat yakuniy baholashga xizmat qildi. Har bir metrika uchun 95% ishonch oralig'i 1000 marta bootstrap qayta tanlash bilan hisoblandi; ansambl va yakka detektor farqi (Δ) juftlashgan bootstrap orqali baholanib, ikki tomonlama p-qiymat keltirildi. YOLO chiqishlari etalon ROI'lar bilan ochko'z usulda, IoU ≥ 0,3 sharti asosida moslashtiriladi.</w:t>
       </w:r>
     </w:p>
@@ -7447,6 +9362,10 @@
         <w:t xml:space="preserve">Muhim nazariy nuans. </w:t>
       </w:r>
       <w:r>
+        <w:rPr>
+          <w:b w:val="0"/>
+          <w:i w:val="0"/>
+        </w:rPr>
         <w:t>Ranjirlangan qatorning prefikslari Φ(λ) ning monoton kamayish zanjirini hosil qiladi. Biroq qat'iy |S| = n′ cheklovida prefiks umumiy holda mutlaq optimal to'plam bo'lishi shart emas — buning kontr-misolini qurish mumkin; kitobning (3.4.4) natijasi aynan prefikslar zanjiri xossasini beradi, mutlaq optimallikni emas. Shu sababli n′ ning yakuniy qiymati Φ bo'yicha emas, balki kross-validatsiyadagi tasniflash sifati P bo'yicha tanlanadi:</w:t>
       </w:r>
     </w:p>
@@ -8598,6 +10517,10 @@
         <w:t xml:space="preserve">Nima uchun bitta mezon yetarli emas. </w:t>
       </w:r>
       <w:r>
+        <w:rPr>
+          <w:b w:val="0"/>
+          <w:i w:val="0"/>
+        </w:rPr>
         <w:t>Nomutanosib bazada (2.5-jadval) umumiy aniqlik ko'p sonli sinf tomonidan boshqariladi va model sifatini yashirishi mumkin. Shuning uchun har bir c sinf "bir-hammaga qarshi" ko'rinishida qaralib, sezgirlik TP/(TP+FN), o'ziga xoslik TN/(TN+FP), aniqlik TP/(TP+FP) va F1 hisoblanadi; ularning makro o'rtachasi, shuningdek makro ROC-AUC, Metyus korrelyatsiya koeffitsienti (MCC) va Cohen κ keltiriladi. Muvozanatli aniqlik makro sezgirlikka tengdir.</w:t>
       </w:r>
     </w:p>
@@ -8621,6 +10544,10 @@
         <w:t xml:space="preserve">Tanlangan belgilar va n′* qiymati. </w:t>
       </w:r>
       <w:r>
+        <w:rPr>
+          <w:b w:val="0"/>
+          <w:i w:val="0"/>
+        </w:rPr>
         <w:t>O'qitish to'plamida ranjirlangan qatorning birinchi o'rinlarini GLCM korrelyatsiya belgilari egalladi: glcm_d1_correlation, glcm_d3_correlation, grad_sobel_std, glcm_d1_dissimilarity, glcm_d3_dissimilarity. Prefiks uzunligi bo'yicha qidiruv (2.6-jadval, 2.5-rasm) kross-validatsiyada n′* = 34 qiymatida maksimum berdi (P = 0,526 [0,480; 0,568]); mustaqil tekshirish to'plamida shu n′ uchun aniqlik 0,628 [0,554; 0,709], makro AUC 0,889 [0,843; 0,932]. To'liq 38 ta belgidan foydalanish natijani biroz pasaytiradi (CV 0,520, val 0,615) — bu shovqinli belgilarning zararli ta'sirini ko'rsatadi.</w:t>
       </w:r>
     </w:p>
@@ -9367,6 +11294,10 @@
         <w:t xml:space="preserve">Halol talqin. </w:t>
       </w:r>
       <w:r>
+        <w:rPr>
+          <w:b w:val="0"/>
+          <w:i w:val="0"/>
+        </w:rPr>
         <w:t>2.5-rasmdagi ishonch oraliqlari qo'shni n′ qiymatlari uchun kuchli kesishadi: masalan n′ = 13 va n′ = 34 uchun tekshirish to'plamidagi oraliqlar qoplanadi. Demak ma'lumotlar hajmi n′ ni bir birlik aniqlikda ajratishga yetarli emas; n′* = 34 — kross-validatsiya bo'yicha eng yaxshi tanlov, biroq qo'shni qiymatlardan statistik ustunligi isbotlanmagan. Bu holat yashirilmasdan ochiq qayd etiladi.</w:t>
       </w:r>
     </w:p>
@@ -9382,6 +11313,10 @@
         <w:t xml:space="preserve">Bulcha tasniflagichning yolg'iz ishlashi. </w:t>
       </w:r>
       <w:r>
+        <w:rPr>
+          <w:b w:val="0"/>
+          <w:i w:val="0"/>
+        </w:rPr>
         <w:t>Etalon ROI'lar ustida (detektorsiz, 148 ta ROI) tasniflagich aniqlik 0,628 [0,554; 0,709], makro sezgirlik 0,453 [0,347; 0,568], makro o'ziga xoslik 0,917 [0,900; 0,934] va makro ROC-AUC 0,889 [0,843; 0,932] ko'rsatdi. Past aniqlik va yuqori AUC birikmasi muhim: model sinflarni tartiblash (ranking) bo'yicha kuchli, biroq argmin qoidasi bilan qaror qabul qilishda nomutanosiblikdan zarar ko'radi. Aynan shu sababli u detektorni almashtira olmaydi, lekin uni to'ldiradi.</w:t>
       </w:r>
     </w:p>
@@ -9397,6 +11332,10 @@
         <w:t xml:space="preserve">Gibrid ansambl: qaysi mezon o'sadi? </w:t>
       </w:r>
       <w:r>
+        <w:rPr>
+          <w:b w:val="0"/>
+          <w:i w:val="0"/>
+        </w:rPr>
         <w:t>Uch detektor uchun to'liq metrika to'plami 2.7-jadvalda, farqlarning statistik ahamiyati 2.8-jadvalda keltirilgan. Natija bir xil emas va aynan shu ilmiy qiziqish uyg'otadi.</w:t>
       </w:r>
     </w:p>
@@ -9407,18 +11346,15 @@
       </w:pPr>
       <w:r>
         <w:rPr>
+          <w:b/>
+          <w:i w:val="0"/>
+        </w:rPr>
+        <w:t>YOLO11s</w:t>
+      </w:r>
+      <w:r>
+        <w:rPr>
           <w:b w:val="0"/>
-        </w:rPr>
-      </w:r>
-      <w:r>
-        <w:rPr>
-          <w:b/>
-        </w:rPr>
-        <w:t>YOLO11s</w:t>
-      </w:r>
-      <w:r>
-        <w:rPr>
-          <w:b w:val="0"/>
+          <w:i w:val="0"/>
         </w:rPr>
         <w:t xml:space="preserve"> (kuchsizroq detektor, α* = 0,75, 95 mos ROI): barcha asosiy mezonlar sezilarli o'sdi — aniqlik 0,737 → 0,853 (Δ = +0,116 [0,053; 0,189], p &lt; 0,001), makro sezgirlik 0,439 → 0,513 (p &lt; 0,001), makro AUC 0,729 → 0,852 (p = 0,002), Cohen κ 0,616 → 0,773.</w:t>
       </w:r>
@@ -9430,18 +11366,15 @@
       </w:pPr>
       <w:r>
         <w:rPr>
+          <w:b/>
+          <w:i w:val="0"/>
+        </w:rPr>
+        <w:t>YOLO11l</w:t>
+      </w:r>
+      <w:r>
+        <w:rPr>
           <w:b w:val="0"/>
-        </w:rPr>
-      </w:r>
-      <w:r>
-        <w:rPr>
-          <w:b/>
-        </w:rPr>
-        <w:t>YOLO11l</w:t>
-      </w:r>
-      <w:r>
-        <w:rPr>
-          <w:b w:val="0"/>
+          <w:i w:val="0"/>
         </w:rPr>
         <w:t xml:space="preserve"> (kuchli detektor, α* = 0,15, 105 mos ROI): umumiy aniqlik deyarli o'zgarmadi — 0,800 → 0,810 (p = 0,868, statistik jihatdan ahamiyatsiz). Ammo makro sezgirlik 0,575 → 0,709 (Δ = +0,134 [0,009; 0,255], p = 0,032) va makro AUC 0,801 → 0,892 sezilarli yaxshilandi.</w:t>
       </w:r>
@@ -9453,18 +11386,15 @@
       </w:pPr>
       <w:r>
         <w:rPr>
+          <w:b/>
+          <w:i w:val="0"/>
+        </w:rPr>
+        <w:t>YOLO11l-v2</w:t>
+      </w:r>
+      <w:r>
+        <w:rPr>
           <w:b w:val="0"/>
-        </w:rPr>
-      </w:r>
-      <w:r>
-        <w:rPr>
-          <w:b/>
-        </w:rPr>
-        <w:t>YOLO11l-v2</w:t>
-      </w:r>
-      <w:r>
-        <w:rPr>
-          <w:b w:val="0"/>
+          <w:i w:val="0"/>
         </w:rPr>
         <w:t xml:space="preserve"> (eng kuchli detektor, α* = 0,90, 103 mos ROI): aniqlik 0,835 → 0,854 (p = 0,448) — ahamiyatsiz; faqat makro AUC 0,759 → 0,793 (p &lt; 0,001) sezilarli o'sdi.</w:t>
       </w:r>
@@ -12045,6 +13975,10 @@
         <w:t xml:space="preserve">Yutuq qayerdan keladi. </w:t>
       </w:r>
       <w:r>
+        <w:rPr>
+          <w:b w:val="0"/>
+          <w:i w:val="0"/>
+        </w:rPr>
         <w:t>2.9-jadval va 2.7-rasm buni yaqqol ko'rsatadi (YOLO11l). Ansambl kam uchraydigan, klinik jihatdan muhim sinflarda sezgirlikni keskin oshiradi: kalsifikatsiya 0,84 → 0,97, assimetriya 0,25 → 0,75, BIRADS 1-2 0,00 → 0,33. Buning evaziga ko'p sonli limfa tuguni sinfida sezgirlik 0,96 dan 0,80 gacha tushadi. Aynan shu almashuv umumiy aniqlikni deyarli o'zgarishsiz qoldiradi, lekin makro sezgirlikni va AUC ni oshiradi. Skrining kontekstida bu maqbul kelishuv: kalsifikatsiya va assimetriya o'tkazib yuborilishi limfa tugunini noto'g'ri belgilashdan ancha qimmatga tushadi.</w:t>
       </w:r>
     </w:p>
@@ -13049,6 +14983,10 @@
         <w:t xml:space="preserve">Ishonch va IoU chegaralariga sezgirlik. </w:t>
       </w:r>
       <w:r>
+        <w:rPr>
+          <w:b w:val="0"/>
+          <w:i w:val="0"/>
+        </w:rPr>
         <w:t>2.10-jadvalda chegaralar o'zgartirilgan holatlar keltirilgan (YOLO11s asosida). Chegara conf = 0,15 ga ko'tarilganda (75 mos ROI) detektorning o'zi 0,907 aniqlikka chiqadi, chunki past ishonchli chiqishlar filtrlanadi; ansambl bu holda qarorlarni umuman o'zgartirmaydi (0,907, p = 1,000). Shu bilan birga makro AUC 0,737 dan 0,848 gacha o'sadi — tartiblash sifati baribir yaxshilanadi. Mos kelish chegarasi IoU ≥ 0,5 gacha qattiqlashtirilganda (88 mos ROI) ansambl aniqlikni 0,705 dan 0,818 gacha (11,4 foiz punkt, p &lt; 0,001) ko'taradi.</w:t>
       </w:r>
     </w:p>
@@ -13663,6 +15601,10 @@
         <w:t xml:space="preserve">Cheklovlar. </w:t>
       </w:r>
       <w:r>
+        <w:rPr>
+          <w:b w:val="0"/>
+          <w:i w:val="0"/>
+        </w:rPr>
         <w:t>Baza hajmi kichik: tekshirish to'plamida moslashgan detektsiyalar soni 75–105 oralig'ida, ba'zi sinflarda atigi 3–6 ta misol. Shu sababli ishonch oraliqlari keng va bir qator farqlar statistik ahamiyatga ega emas (2.8-jadval). α* o'qitish to'plamida tanlangan bo'lsa-da, u ham cheklangan hajmga ega. Arxitektura buzilishi sinfida atigi ikkita o'qitish misoli bor va u tekshirish to'plamida umuman mos kelmagan. Xulosalar ko'p markazli, kattaroq bazada takrorlanishi lozim.</w:t>
       </w:r>
     </w:p>
@@ -13682,6 +15624,7 @@
       <w:r>
         <w:rPr>
           <w:b w:val="0"/>
+          <w:i w:val="0"/>
         </w:rPr>
         <w:t>Bulcha dasturlash mezoni asosidagi belgi tanlash mammografik ko'p sinfli masalaga umumlashtirildi; kross-validatsiya bo'yicha 38 ta belgidan n′* = 34 tasi eng yaxshi natija berdi (P = 0,526 [0,480; 0,568]), biroq qo'shni n′ qiymatlaridan statistik ustunligi isbotlanmadi.</w:t>
       </w:r>
@@ -13694,6 +15637,7 @@
       <w:r>
         <w:rPr>
           <w:b w:val="0"/>
+          <w:i w:val="0"/>
         </w:rPr>
         <w:t>Qat'iy |S| = n′ cheklovida ranjirlangan qator prefiksi mutlaq optimal to'plam bo'lishi shart emasligi ko'rsatildi; shu sababli n′* tasniflash sifati P bo'yicha tanlanadi.</w:t>
       </w:r>
@@ -13706,6 +15650,7 @@
       <w:r>
         <w:rPr>
           <w:b w:val="0"/>
+          <w:i w:val="0"/>
         </w:rPr>
         <w:t>Nomutanosib bazada umumiy aniqlik yolg'iz mezon sifatida yetarli emasligi ko'rsatildi: YOLO11l uchun ansambl aniqlikni o'zgartirmadi (p = 0,868), lekin makro sezgirlikni 0,575 dan 0,709 gacha (p = 0,032) va makro AUC ni 0,801 dan 0,892 gacha oshirdi.</w:t>
       </w:r>
@@ -13718,6 +15663,7 @@
       <w:r>
         <w:rPr>
           <w:b w:val="0"/>
+          <w:i w:val="0"/>
         </w:rPr>
         <w:t>Kuchsizroq detektor (YOLO11s) uchun ansambl barcha mezonlarni sezilarli yaxshiladi: aniqlik 0,737 → 0,853 (p &lt; 0,001), makro AUC 0,729 → 0,852, Cohen κ 0,616 → 0,773.</w:t>
       </w:r>
@@ -13730,6 +15676,7 @@
       <w:r>
         <w:rPr>
           <w:b w:val="0"/>
+          <w:i w:val="0"/>
         </w:rPr>
         <w:t>Yutuq kam uchraydigan, klinik jihatdan muhim sinflarda jamlangan (kalsifikatsiya 0,84 → 0,97, assimetriya 0,25 → 0,75) va ko'p sonli sinf hisobiga erishiladi — skrining uchun maqbul almashuv.</w:t>
       </w:r>
@@ -13742,6 +15689,7 @@
       <w:r>
         <w:rPr>
           <w:b w:val="0"/>
+          <w:i w:val="0"/>
         </w:rPr>
         <w:t>Bulcha tasniflagich yolg'iz yuqori ajratuvchanlik (0,889 [0,843; 0,932]) va past aniqlik (0,628 [0,554; 0,709]) ko'rsatadi, ya'ni uning roli detektorni to'ldirish — o'rin bosish emas.</w:t>
       </w:r>
@@ -13856,12 +15804,6 @@
       </w:pPr>
       <w:r>
         <w:rPr>
-          <w:b w:val="0"/>
-          <w:i w:val="0"/>
-        </w:rPr>
-      </w:r>
-      <w:r>
-        <w:rPr>
           <w:b/>
           <w:i w:val="0"/>
         </w:rPr>
@@ -13882,12 +15824,6 @@
       </w:pPr>
       <w:r>
         <w:rPr>
-          <w:b w:val="0"/>
-          <w:i w:val="0"/>
-        </w:rPr>
-      </w:r>
-      <w:r>
-        <w:rPr>
           <w:b/>
           <w:i w:val="0"/>
         </w:rPr>
@@ -14008,12 +15944,6 @@
       </w:pPr>
       <w:r>
         <w:rPr>
-          <w:b w:val="0"/>
-          <w:i w:val="0"/>
-        </w:rPr>
-      </w:r>
-      <w:r>
-        <w:rPr>
           <w:b/>
           <w:i w:val="0"/>
         </w:rPr>
@@ -14032,12 +15962,6 @@
         <w:ind w:firstLine="567"/>
         <w:jc w:val="both"/>
       </w:pPr>
-      <w:r>
-        <w:rPr>
-          <w:b w:val="0"/>
-          <w:i w:val="0"/>
-        </w:rPr>
-      </w:r>
       <w:r>
         <w:rPr>
           <w:b/>
@@ -14158,23 +16082,62 @@
       </w:pPr>
       <w:r>
         <w:rPr>
+          <w:b/>
+          <w:i w:val="0"/>
+        </w:rPr>
+        <w:t>Model Studio</w:t>
+      </w:r>
+      <w:r>
+        <w:rPr>
           <w:b w:val="0"/>
           <w:i w:val="0"/>
         </w:rPr>
-      </w:r>
-      <w:r>
-        <w:rPr>
-          <w:b/>
-          <w:i w:val="0"/>
-        </w:rPr>
-        <w:t>Model Studio</w:t>
-      </w:r>
+        <w:t xml:space="preserve"> — foydalanuvchining o'z annotatsiyalaridan yangi YOLO modelini grafik protsessor (GPU) da o'qitish imkonini beruvchi modul. Konveyer quyidagi bosqichlardan iborat: (i) annotatsiyalardan Ultralytics YOLO formatidagi datasetni (</w:t>
+      </w:r>
+      <m:oMath>
+        <m:r>
+          <m:rPr>
+            <m:sty m:val="p"/>
+          </m:rPr>
+          <m:t xml:space="preserve">images/{train,val}</m:t>
+        </m:r>
+      </m:oMath>
       <w:r>
         <w:rPr>
           <w:b w:val="0"/>
           <w:i w:val="0"/>
         </w:rPr>
-        <w:t xml:space="preserve"> — foydalanuvchining o'z annotatsiyalaridan yangi YOLO modelini grafik protsessor (GPU) da o'qitish imkonini beruvchi modul. Konveyer quyidagi bosqichlardan iborat: (i) annotatsiyalardan Ultralytics YOLO formatidagi datasetni ($\texttt{images/\{train,val\}}$, $\texttt{labels/\{train,val\}}$, $\texttt{data.yaml}$) avtomatik tayyorlash, bunda bo'linish bemor darajasida amalga oshiriladi (data leakage'ning oldini olish uchun); (ii) dataset yaxlitligini tekshirish (rasm soni, sinf taqsimoti, rasm-belgi mosligi, buzuq fayllar); (iii) to'liq giperparametrlar bilan o'qitishni boshlash.</w:t>
+        <w:t xml:space="preserve">, </w:t>
+      </w:r>
+      <m:oMath>
+        <m:r>
+          <m:rPr>
+            <m:sty m:val="p"/>
+          </m:rPr>
+          <m:t xml:space="preserve">labels/{train,val}</m:t>
+        </m:r>
+      </m:oMath>
+      <w:r>
+        <w:rPr>
+          <w:b w:val="0"/>
+          <w:i w:val="0"/>
+        </w:rPr>
+        <w:t xml:space="preserve">, </w:t>
+      </w:r>
+      <m:oMath>
+        <m:r>
+          <m:rPr>
+            <m:sty m:val="p"/>
+          </m:rPr>
+          <m:t xml:space="preserve">data.yaml</m:t>
+        </m:r>
+      </m:oMath>
+      <w:r>
+        <w:rPr>
+          <w:b w:val="0"/>
+          <w:i w:val="0"/>
+        </w:rPr>
+        <w:t>) avtomatik tayyorlash, bunda bo'linish bemor darajasida amalga oshiriladi (data leakage'ning oldini olish uchun); (ii) dataset yaxlitligini tekshirish (rasm soni, sinf taqsimoti, rasm-belgi mosligi, buzuq fayllar); (iii) to'liq giperparametrlar bilan o'qitishni boshlash.</w:t>
       </w:r>
     </w:p>
     <w:p>
@@ -14200,7 +16163,22 @@
           <w:b w:val="0"/>
           <w:i w:val="0"/>
         </w:rPr>
-        <w:t>Model Studio dataset tekshiruvi moduli o'qitishdan oldin ma'lumotlar yaxlitligini avtomatik nazorat qiladi: u har bir bo'lim (train/val) uchun tasvirlar sonini sanaydi, sinflar taqsimotini hisoblaydi (sinflar muvozanatsizligini aniqlash uchun), har bir tasvirga mos belgi faylining mavjudligini tekshiradi va bo'sh yoki buzilgan fayllarni aniqlaydi. Bu tekshiruv o'qitishdagi yashirin xatolarning oldini oladi va ma'lumot sifatini kafolatlaydi. Dataset Ultralytics formatida — $\texttt{data.yaml}$ konfiguratsiya fayli, sinf nomlari va yo'llar bilan — tashkil etiladi.</w:t>
+        <w:t xml:space="preserve">Model Studio dataset tekshiruvi moduli o'qitishdan oldin ma'lumotlar yaxlitligini avtomatik nazorat qiladi: u har bir bo'lim (train/val) uchun tasvirlar sonini sanaydi, sinflar taqsimotini hisoblaydi (sinflar muvozanatsizligini aniqlash uchun), har bir tasvirga mos belgi faylining mavjudligini tekshiradi va bo'sh yoki buzilgan fayllarni aniqlaydi. Bu tekshiruv o'qitishdagi yashirin xatolarning oldini oladi va ma'lumot sifatini kafolatlaydi. Dataset Ultralytics formatida — </w:t>
+      </w:r>
+      <m:oMath>
+        <m:r>
+          <m:rPr>
+            <m:sty m:val="p"/>
+          </m:rPr>
+          <m:t xml:space="preserve">data.yaml</m:t>
+        </m:r>
+      </m:oMath>
+      <w:r>
+        <w:rPr>
+          <w:b w:val="0"/>
+          <w:i w:val="0"/>
+        </w:rPr>
+        <w:t xml:space="preserve"> konfiguratsiya fayli, sinf nomlari va yo'llar bilan — tashkil etiladi.</w:t>
       </w:r>
     </w:p>
     <w:p>
@@ -14213,7 +16191,22 @@
           <w:b w:val="0"/>
           <w:i w:val="0"/>
         </w:rPr>
-        <w:t>O'qitish davomida metrikalar (yo'qotish komponentlari, mAP, precision, recall) har bir epochda $\texttt{results.csv}$ fayliga yoziladi va web-interfeysga jonli uzatiladi. Foydalanuvchi grafiklar orqali o'qitish borishini real vaqtda kuzatadi va zarur bo'lsa jarayonni to'xtatadi. To'xtatilganda oxirgi nuqta (last.pt) saqlanib, keyin shu nuqtadan davom ettirish (Resume) mumkin. O'qitilgan eng yaxshi model (best.pt) validatsiya mAP'i bo'yicha tanlanib, avtomatik tarzda ishlatishga joylashtiriladi.</w:t>
+        <w:t xml:space="preserve">O'qitish davomida metrikalar (yo'qotish komponentlari, mAP, precision, recall) har bir epochda </w:t>
+      </w:r>
+      <m:oMath>
+        <m:r>
+          <m:rPr>
+            <m:sty m:val="p"/>
+          </m:rPr>
+          <m:t xml:space="preserve">results.csv</m:t>
+        </m:r>
+      </m:oMath>
+      <w:r>
+        <w:rPr>
+          <w:b w:val="0"/>
+          <w:i w:val="0"/>
+        </w:rPr>
+        <w:t xml:space="preserve"> fayliga yoziladi va web-interfeysga jonli uzatiladi. Foydalanuvchi grafiklar orqali o'qitish borishini real vaqtda kuzatadi va zarur bo'lsa jarayonni to'xtatadi. To'xtatilganda oxirgi nuqta (last.pt) saqlanib, keyin shu nuqtadan davom ettirish (Resume) mumkin. O'qitilgan eng yaxshi model (best.pt) validatsiya mAP'i bo'yicha tanlanib, avtomatik tarzda ishlatishga joylashtiriladi.</w:t>
       </w:r>
     </w:p>
     <w:p>
@@ -14223,12 +16216,6 @@
       </w:pPr>
       <w:r>
         <w:rPr>
-          <w:b w:val="0"/>
-          <w:i w:val="0"/>
-        </w:rPr>
-      </w:r>
-      <w:r>
-        <w:rPr>
           <w:b/>
           <w:i w:val="0"/>
         </w:rPr>
@@ -14467,12 +16454,6 @@
       </w:pPr>
       <w:r>
         <w:rPr>
-          <w:b w:val="0"/>
-          <w:i w:val="0"/>
-        </w:rPr>
-      </w:r>
-      <w:r>
-        <w:rPr>
           <w:b/>
           <w:i w:val="0"/>
         </w:rPr>
@@ -14493,12 +16474,6 @@
       </w:pPr>
       <w:r>
         <w:rPr>
-          <w:b w:val="0"/>
-          <w:i w:val="0"/>
-        </w:rPr>
-      </w:r>
-      <w:r>
-        <w:rPr>
           <w:b/>
           <w:i w:val="0"/>
         </w:rPr>
@@ -14519,12 +16494,6 @@
       </w:pPr>
       <w:r>
         <w:rPr>
-          <w:b w:val="0"/>
-          <w:i w:val="0"/>
-        </w:rPr>
-      </w:r>
-      <w:r>
-        <w:rPr>
           <w:b/>
           <w:i w:val="0"/>
         </w:rPr>
@@ -14545,12 +16514,6 @@
       </w:pPr>
       <w:r>
         <w:rPr>
-          <w:b w:val="0"/>
-          <w:i w:val="0"/>
-        </w:rPr>
-      </w:r>
-      <w:r>
-        <w:rPr>
           <w:b/>
           <w:i w:val="0"/>
         </w:rPr>
@@ -14580,6 +16543,7 @@
       <w:r>
         <w:rPr>
           <w:b w:val="0"/>
+          <w:i w:val="0"/>
         </w:rPr>
         <w:t>MAMOGRAF FastAPI backend va web-interfeysida amalga oshirilgan; har bir DICOM yuklashda PHI avtomatik anonimlashtiriladi.</w:t>
       </w:r>
@@ -14592,6 +16556,7 @@
       <w:r>
         <w:rPr>
           <w:b w:val="0"/>
+          <w:i w:val="0"/>
         </w:rPr>
         <w:t>Annotatsiya, faol o'rganish va AI yordami (smart-click, uncertainty) radiolog ishini tezlashtiradi.</w:t>
       </w:r>
@@ -14604,6 +16569,7 @@
       <w:r>
         <w:rPr>
           <w:b w:val="0"/>
+          <w:i w:val="0"/>
         </w:rPr>
         <w:t>Model Studio GPU'da subprocess sifatida o'qitishni (Stop/Resume), jonli metrikalar va resurslar monitoringini ta'minlaydi.</w:t>
       </w:r>
@@ -14616,6 +16582,7 @@
       <w:r>
         <w:rPr>
           <w:b w:val="0"/>
+          <w:i w:val="0"/>
         </w:rPr>
         <w:t>O'qitishni alohida GPU serverga uzatuvchi taqsimlangan arxitektura datasetni oldindan yuklash hisobiga darhol start, uzilishlarga chidamlilik va modelni avtomatik joylashtirishni ta'minlaydi.</w:t>
       </w:r>
@@ -14628,6 +16595,7 @@
       <w:r>
         <w:rPr>
           <w:b w:val="0"/>
+          <w:i w:val="0"/>
         </w:rPr>
         <w:t>Avtomatik xulosa lokal til modelida grounded, deterministik va klinik atamalarga mos tarzda shakllantiriladi.</w:t>
       </w:r>
@@ -14640,6 +16608,7 @@
       <w:r>
         <w:rPr>
           <w:b w:val="0"/>
+          <w:i w:val="0"/>
         </w:rPr>
         <w:t>Xulosa DICOM SR sifatida eksport qilinadi va PACS bilan integratsiyalashgan, bu klinik ish oqimini to'liq qo'llab-quvvatlaydi.</w:t>
       </w:r>
@@ -14810,6 +16779,10 @@
         <w:t xml:space="preserve">Ishning ilmiy yangiligi. </w:t>
       </w:r>
       <w:r>
+        <w:rPr>
+          <w:b w:val="0"/>
+          <w:i w:val="0"/>
+        </w:rPr>
         <w:t>DICOM-konveyer, model yordamida belgilash, noaniqlikka asoslangan namuna tanlash, ko'p-annotator kelishuvini baholash va masofaviy GPU'da qayta o'qitishni yagona yopiq tsiklga birlashtirgan, formal matematik model bilan asoslangan annotatsiya yig'ish metodikasi taklif qilingan.</w:t>
       </w:r>
     </w:p>
@@ -19187,6 +21160,10 @@
         <w:t xml:space="preserve">Asosiy natija. </w:t>
       </w:r>
       <w:r>
+        <w:rPr>
+          <w:b w:val="0"/>
+          <w:i w:val="0"/>
+        </w:rPr>
         <w:t>Klinik jihatdan eng muhim sinflarda — ko'krak o'smasi (mass) va limfa tugunida (lymph node) — model yuqori aniqlik ko'rsatadi: AP@50 mos ravishda 0.51 va 0.72, to'liqlik (recall) esa 0.58 va 0.82. Aynan shu ikki sinf bo'yicha o'rtacha aniqlik mAP@50 = 0.61 ni tashkil etadi — bu kichik hajmli pilot baza uchun yuqori ko'rsatkich. Yuqori recall (limfa tuguni uchun 0.82) skrining vazifasida — patologiyani o'tkazib yubormaslikda — ayniqsa qimmatli.</w:t>
       </w:r>
     </w:p>
@@ -19200,7 +21177,19 @@
           <w:b w:val="0"/>
           <w:i w:val="0"/>
         </w:rPr>
-        <w:t>Annotatsiya yig'ish samaradorligi nuqtai nazaridan model yordamida belgilash radiolog mehnatini sezilarli kamaytiradi: yuqori recall'ga ega sinflarda (mass, lymph node) ramkalarning aksariyati avtomatik joylanadi va radiolog ularni noldan chizish o'rniga faqat tasdiqlaydi yoki to'g'irlaydi. (9)–(56) ifodalar asosida baholanganda, tezlashish koeffitsiyenti $S$ aynan shu sinflarda 2–3 baravarni tashkil etadi. Bu esa, o'z navbatida, (54)–(55) o'rganish egri chizig'iga muvofiq keyingi iteratsiyalarda baza hajmini va umumiy aniqlikni izchil oshirishga imkon beradi.</w:t>
+        <w:t xml:space="preserve">Annotatsiya yig'ish samaradorligi nuqtai nazaridan model yordamida belgilash radiolog mehnatini sezilarli kamaytiradi: yuqori recall'ga ega sinflarda (mass, lymph node) ramkalarning aksariyati avtomatik joylanadi va radiolog ularni noldan chizish o'rniga faqat tasdiqlaydi yoki to'g'irlaydi. (9)–(56) ifodalar asosida baholanganda, tezlashish koeffitsiyenti </w:t>
+      </w:r>
+      <m:oMath>
+        <m:r>
+          <m:t xml:space="preserve">S</m:t>
+        </m:r>
+      </m:oMath>
+      <w:r>
+        <w:rPr>
+          <w:b w:val="0"/>
+          <w:i w:val="0"/>
+        </w:rPr>
+        <w:t xml:space="preserve"> aynan shu sinflarda 2–3 baravarni tashkil etadi. Bu esa, o'z navbatida, (54)–(55) o'rganish egri chizig'iga muvofiq keyingi iteratsiyalarda baza hajmini va umumiy aniqlikni izchil oshirishga imkon beradi.</w:t>
       </w:r>
     </w:p>
     <w:p>
@@ -19253,6 +21242,7 @@
       <w:r>
         <w:rPr>
           <w:b w:val="0"/>
+          <w:i w:val="0"/>
         </w:rPr>
         <w:t>Settles B. Active Learning Literature Survey. University of Wisconsin–Madison, 2009.</w:t>
       </w:r>
@@ -19265,6 +21255,7 @@
       <w:r>
         <w:rPr>
           <w:b w:val="0"/>
+          <w:i w:val="0"/>
         </w:rPr>
         <w:t>Gal Y., Islam R., Ghahramani Z. Deep Bayesian Active Learning with Image Data. ICML, 2017.</w:t>
       </w:r>
@@ -19277,6 +21268,7 @@
       <w:r>
         <w:rPr>
           <w:b w:val="0"/>
+          <w:i w:val="0"/>
         </w:rPr>
         <w:t>Lin T.-Y. et al. Focal Loss for Dense Object Detection. ICCV, 2017.</w:t>
       </w:r>
@@ -19289,6 +21281,7 @@
       <w:r>
         <w:rPr>
           <w:b w:val="0"/>
+          <w:i w:val="0"/>
         </w:rPr>
         <w:t>Zheng Z. et al. Distance-IoU Loss: Faster and Better Learning for Bounding Box Regression. AAAI, 2020.</w:t>
       </w:r>
@@ -19301,6 +21294,7 @@
       <w:r>
         <w:rPr>
           <w:b w:val="0"/>
+          <w:i w:val="0"/>
         </w:rPr>
         <w:t>Jocher G. et al. Ultralytics YOLO (v8–v11). 2023–2024.</w:t>
       </w:r>
@@ -19313,6 +21307,7 @@
       <w:r>
         <w:rPr>
           <w:b w:val="0"/>
+          <w:i w:val="0"/>
         </w:rPr>
         <w:t>Cui Y. et al. Class-Balanced Loss Based on Effective Number of Samples. CVPR, 2019.</w:t>
       </w:r>
@@ -19325,6 +21320,7 @@
       <w:r>
         <w:rPr>
           <w:b w:val="0"/>
+          <w:i w:val="0"/>
         </w:rPr>
         <w:t>Cohen J. A Coefficient of Agreement for Nominal Scales. Educational and Psychological Measurement, 1960.</w:t>
       </w:r>
@@ -19337,6 +21333,7 @@
       <w:r>
         <w:rPr>
           <w:b w:val="0"/>
+          <w:i w:val="0"/>
         </w:rPr>
         <w:t>Fleiss J.L. Measuring Nominal Scale Agreement Among Many Raters. Psychological Bulletin, 1971.</w:t>
       </w:r>
@@ -19349,6 +21346,7 @@
       <w:r>
         <w:rPr>
           <w:b w:val="0"/>
+          <w:i w:val="0"/>
         </w:rPr>
         <w:t>Solovyev R., Wang W., Gabruseva T. Weighted Boxes Fusion. Image and Vision Computing, 2021.</w:t>
       </w:r>
@@ -19361,6 +21359,7 @@
       <w:r>
         <w:rPr>
           <w:b w:val="0"/>
+          <w:i w:val="0"/>
         </w:rPr>
         <w:t>Pizer S.M. et al. Adaptive Histogram Equalization (CLAHE). Computer Vision, Graphics, and Image Processing, 1987.</w:t>
       </w:r>
@@ -19373,6 +21372,7 @@
       <w:r>
         <w:rPr>
           <w:b w:val="0"/>
+          <w:i w:val="0"/>
         </w:rPr>
         <w:t>DICOM Standard PS3.1–PS3.20. NEMA, 2024.</w:t>
       </w:r>
@@ -19385,6 +21385,7 @@
       <w:r>
         <w:rPr>
           <w:b w:val="0"/>
+          <w:i w:val="0"/>
         </w:rPr>
         <w:t>Turaqulov H. va b. BCA-YOLO va radiomik Faster R-CNN asosida ko'krak o'smalarini aniqlash. (Muallif maqolalari).</w:t>
       </w:r>
@@ -19475,12 +21476,6 @@
       </w:pPr>
       <w:r>
         <w:rPr>
-          <w:b w:val="0"/>
-          <w:i w:val="0"/>
-        </w:rPr>
-      </w:r>
-      <w:r>
-        <w:rPr>
           <w:b/>
           <w:i w:val="0"/>
         </w:rPr>
@@ -19501,12 +21496,6 @@
       </w:pPr>
       <w:r>
         <w:rPr>
-          <w:b w:val="0"/>
-          <w:i w:val="0"/>
-        </w:rPr>
-      </w:r>
-      <w:r>
-        <w:rPr>
           <w:b/>
           <w:i w:val="0"/>
         </w:rPr>
@@ -19525,12 +21514,6 @@
         <w:ind w:firstLine="567"/>
         <w:jc w:val="both"/>
       </w:pPr>
-      <w:r>
-        <w:rPr>
-          <w:b w:val="0"/>
-          <w:i w:val="0"/>
-        </w:rPr>
-      </w:r>
       <w:r>
         <w:rPr>
           <w:b/>
@@ -19833,7 +21816,28 @@
           <w:b w:val="0"/>
           <w:i w:val="0"/>
         </w:rPr>
-        <w:t>BI-RADS kabi ordinal baholashda kuzatuvchilararo moslik kvadratik og'irlikli Koen kappasi ($\kappa_w$) bilan o'lchanadi — bu yaqin kategoriyalardagi xatolarni uzoq kategoriyalardagidan kam jazolaydi:</w:t>
+        <w:t>BI-RADS kabi ordinal baholashda kuzatuvchilararo moslik kvadratik og'irlikli Koen kappasi (</w:t>
+      </w:r>
+      <m:oMath>
+        <m:sSub>
+          <m:e>
+            <m:r>
+              <m:t xml:space="preserve">κ</m:t>
+            </m:r>
+          </m:e>
+          <m:sub>
+            <m:r>
+              <m:t xml:space="preserve">w</m:t>
+            </m:r>
+          </m:sub>
+        </m:sSub>
+      </m:oMath>
+      <w:r>
+        <w:rPr>
+          <w:b w:val="0"/>
+          <w:i w:val="0"/>
+        </w:rPr>
+        <w:t>) bilan o'lchanadi — bu yaqin kategoriyalardagi xatolarni uzoq kategoriyalardagidan kam jazolaydi:</w:t>
       </w:r>
     </w:p>
     <w:p>
@@ -19962,7 +21966,19 @@
           <w:b w:val="0"/>
           <w:i w:val="0"/>
         </w:rPr>
-        <w:t>Metrikalarning statistik ishonchliligini baholash uchun bootstrap usuli ishlatiladi: test to'plamidan $B$ marta takroriy tanlash o'tkazilib, har safar metrika qayta hisoblanadi va olingan taqsimotdan 95% ishonch oralig'i aniqlanadi. Bu nuqtaviy bahodan ko'ra ko'proq ma'lumot beradi va modellar o'rtasidagi farqning ahamiyatliligini baholash imkonini beradi.</w:t>
+        <w:t xml:space="preserve">Metrikalarning statistik ishonchliligini baholash uchun bootstrap usuli ishlatiladi: test to'plamidan </w:t>
+      </w:r>
+      <m:oMath>
+        <m:r>
+          <m:t xml:space="preserve">B</m:t>
+        </m:r>
+      </m:oMath>
+      <w:r>
+        <w:rPr>
+          <w:b w:val="0"/>
+          <w:i w:val="0"/>
+        </w:rPr>
+        <w:t xml:space="preserve"> marta takroriy tanlash o'tkazilib, har safar metrika qayta hisoblanadi va olingan taqsimotdan 95% ishonch oralig'i aniqlanadi. Bu nuqtaviy bahodan ko'ra ko'proq ma'lumot beradi va modellar o'rtasidagi farqning ahamiyatliligini baholash imkonini beradi.</w:t>
       </w:r>
     </w:p>
     <w:p>
@@ -20142,7 +22158,25 @@
           <w:b w:val="0"/>
           <w:i w:val="0"/>
         </w:rPr>
-        <w:t>BCA-YOLO arxitekturasining namunaviy realizatsiyasi bazaviy YOLO ga taxminan 3,1 mln parametr qo'shadi. $\alpha=0$ dagi sog'liq tekshiruvi tasdiqlandi: initsializatsiya paytida modelning oxirigacha oldinga o'tish chiqishi to'rtta mustaqil YOLO oldinga o'tishiga aynan kamayadi, bu oldindan o'rgatilgan og'irliklar bilan to'liq moslikni isbotlaydi.</w:t>
+        <w:t xml:space="preserve">BCA-YOLO arxitekturasining namunaviy realizatsiyasi bazaviy YOLO ga taxminan 3,1 mln parametr qo'shadi. </w:t>
+      </w:r>
+      <m:oMath>
+        <m:r>
+          <m:t xml:space="preserve">α</m:t>
+        </m:r>
+        <m:r>
+          <m:rPr>
+            <m:sty m:val="p"/>
+          </m:rPr>
+          <m:t xml:space="preserve">=0</m:t>
+        </m:r>
+      </m:oMath>
+      <w:r>
+        <w:rPr>
+          <w:b w:val="0"/>
+          <w:i w:val="0"/>
+        </w:rPr>
+        <w:t xml:space="preserve"> dagi sog'liq tekshiruvi tasdiqlandi: initsializatsiya paytida modelning oxirigacha oldinga o'tish chiqishi to'rtta mustaqil YOLO oldinga o'tishiga aynan kamayadi, bu oldindan o'rgatilgan og'irliklar bilan to'liq moslikni isbotlaydi.</w:t>
       </w:r>
     </w:p>
     <w:p>
@@ -20165,23 +22199,53 @@
       </w:pPr>
       <w:r>
         <w:rPr>
+          <w:b/>
+          <w:i w:val="0"/>
+        </w:rPr>
+        <w:t>Muhokama.</w:t>
+      </w:r>
+      <w:r>
+        <w:rPr>
           <w:b w:val="0"/>
           <w:i w:val="0"/>
         </w:rPr>
-      </w:r>
-      <w:r>
-        <w:rPr>
-          <w:b/>
-          <w:i w:val="0"/>
-        </w:rPr>
-        <w:t>Muhokama.</w:t>
-      </w:r>
+        <w:t xml:space="preserve"> BCA bloki kontralateral asimmetriya signalini kiritib, asimmetriya bilan namoyon bo'luvchi shikastlanishlarni aniqlashni yaxshilashi kutiladi. IVC moduli soxta-musbatlarni (bir ko'rinishda ko'rinib, ikkinchisida ko'rinmaydigan) kamaytiradi. Ordinal bosh yuqori BI-RADS toifalarida (</w:t>
+      </w:r>
+      <m:oMath>
+        <m:r>
+          <m:rPr>
+            <m:sty m:val="p"/>
+          </m:rPr>
+          <m:t xml:space="preserve">≥ 4</m:t>
+        </m:r>
+      </m:oMath>
       <w:r>
         <w:rPr>
           <w:b w:val="0"/>
           <w:i w:val="0"/>
         </w:rPr>
-        <w:t xml:space="preserve"> BCA bloki kontralateral asimmetriya signalini kiritib, asimmetriya bilan namoyon bo'luvchi shikastlanishlarni aniqlashni yaxshilashi kutiladi. IVC moduli soxta-musbatlarni (bir ko'rinishda ko'rinib, ikkinchisida ko'rinmaydigan) kamaytiradi. Ordinal bosh yuqori BI-RADS toifalarida ($\geq 4$) — eng muhim klinik qarorlar qabul qilinadigan sohada — baholashni yaxshilaydi va $\kappa_w$ ni oshiradi.</w:t>
+        <w:t xml:space="preserve">) — eng muhim klinik qarorlar qabul qilinadigan sohada — baholashni yaxshilaydi va </w:t>
+      </w:r>
+      <m:oMath>
+        <m:sSub>
+          <m:e>
+            <m:r>
+              <m:t xml:space="preserve">κ</m:t>
+            </m:r>
+          </m:e>
+          <m:sub>
+            <m:r>
+              <m:t xml:space="preserve">w</m:t>
+            </m:r>
+          </m:sub>
+        </m:sSub>
+      </m:oMath>
+      <w:r>
+        <w:rPr>
+          <w:b w:val="0"/>
+          <w:i w:val="0"/>
+        </w:rPr>
+        <w:t xml:space="preserve"> ni oshiradi.</w:t>
       </w:r>
     </w:p>
     <w:p>
@@ -20194,7 +22258,43 @@
           <w:b w:val="0"/>
           <w:i w:val="0"/>
         </w:rPr>
-        <w:t>Taklif etilgan komponentlarning kutilayotgan hissasini nazariy jihatdan asoslash mumkin. BCA bloki kontralateral asimmetriya signalini kiritib, asimmetriya bilan namoyon bo'luvchi shikastlanishlarni (ayniqsa zich to'qimada) aniqlash sezgirligini oshirishi kutiladi — bu radiolog amaliyotiga mos. IVC moduli bir ko'rinishda paydo bo'lib, ikkinchisida tasdiqlanmaydigan soxta-musbatlarni kamaytirib, FROC egri chizig'ida belgilangan soxta-musbat darajasidagi sezgirlikni yaxshilaydi. Ordinal bosh yuqori BI-RADS toifalaridagi ($\geq 4$) baholashni aniqlashtirib, kvadratik og'irlikli kappani ($\kappa_w$) oshiradi.</w:t>
+        <w:t>Taklif etilgan komponentlarning kutilayotgan hissasini nazariy jihatdan asoslash mumkin. BCA bloki kontralateral asimmetriya signalini kiritib, asimmetriya bilan namoyon bo'luvchi shikastlanishlarni (ayniqsa zich to'qimada) aniqlash sezgirligini oshirishi kutiladi — bu radiolog amaliyotiga mos. IVC moduli bir ko'rinishda paydo bo'lib, ikkinchisida tasdiqlanmaydigan soxta-musbatlarni kamaytirib, FROC egri chizig'ida belgilangan soxta-musbat darajasidagi sezgirlikni yaxshilaydi. Ordinal bosh yuqori BI-RADS toifalaridagi (</w:t>
+      </w:r>
+      <m:oMath>
+        <m:r>
+          <m:rPr>
+            <m:sty m:val="p"/>
+          </m:rPr>
+          <m:t xml:space="preserve">≥ 4</m:t>
+        </m:r>
+      </m:oMath>
+      <w:r>
+        <w:rPr>
+          <w:b w:val="0"/>
+          <w:i w:val="0"/>
+        </w:rPr>
+        <w:t>) baholashni aniqlashtirib, kvadratik og'irlikli kappani (</w:t>
+      </w:r>
+      <m:oMath>
+        <m:sSub>
+          <m:e>
+            <m:r>
+              <m:t xml:space="preserve">κ</m:t>
+            </m:r>
+          </m:e>
+          <m:sub>
+            <m:r>
+              <m:t xml:space="preserve">w</m:t>
+            </m:r>
+          </m:sub>
+        </m:sSub>
+      </m:oMath>
+      <w:r>
+        <w:rPr>
+          <w:b w:val="0"/>
+          <w:i w:val="0"/>
+        </w:rPr>
+        <w:t>) oshiradi.</w:t>
       </w:r>
     </w:p>
     <w:p>
@@ -20306,12 +22406,6 @@
       </w:pPr>
       <w:r>
         <w:rPr>
-          <w:b w:val="0"/>
-          <w:i w:val="0"/>
-        </w:rPr>
-      </w:r>
-      <w:r>
-        <w:rPr>
           <w:b/>
           <w:i w:val="0"/>
         </w:rPr>
@@ -20332,12 +22426,6 @@
       </w:pPr>
       <w:r>
         <w:rPr>
-          <w:b w:val="0"/>
-          <w:i w:val="0"/>
-        </w:rPr>
-      </w:r>
-      <w:r>
-        <w:rPr>
           <w:b/>
           <w:i w:val="0"/>
         </w:rPr>
@@ -20358,12 +22446,6 @@
       </w:pPr>
       <w:r>
         <w:rPr>
-          <w:b w:val="0"/>
-          <w:i w:val="0"/>
-        </w:rPr>
-      </w:r>
-      <w:r>
-        <w:rPr>
           <w:b/>
           <w:i w:val="0"/>
         </w:rPr>
@@ -20384,12 +22466,6 @@
       </w:pPr>
       <w:r>
         <w:rPr>
-          <w:b w:val="0"/>
-          <w:i w:val="0"/>
-        </w:rPr>
-      </w:r>
-      <w:r>
-        <w:rPr>
           <w:b/>
           <w:i w:val="0"/>
         </w:rPr>
@@ -20410,12 +22486,6 @@
       </w:pPr>
       <w:r>
         <w:rPr>
-          <w:b w:val="0"/>
-          <w:i w:val="0"/>
-        </w:rPr>
-      </w:r>
-      <w:r>
-        <w:rPr>
           <w:b/>
           <w:i w:val="0"/>
         </w:rPr>
@@ -20459,6 +22529,7 @@
       <w:r>
         <w:rPr>
           <w:b w:val="0"/>
+          <w:i w:val="0"/>
         </w:rPr>
         <w:t>Modellar ochiq VinDr-Mammo to'plamida umume'tirof etilgan metrikalar (IoU, mAP, F1, κw) bilan baholandi.</w:t>
       </w:r>
@@ -20471,6 +22542,7 @@
       <w:r>
         <w:rPr>
           <w:b w:val="0"/>
+          <w:i w:val="0"/>
         </w:rPr>
         <w:t>Gibrid (radiomika + chuqur o'rganish) yondashuv aniqlik 0,904, F1 0,89 va mAP 0,78 natijalarini ko'rsatdi.</w:t>
       </w:r>
@@ -20483,6 +22555,7 @@
       <w:r>
         <w:rPr>
           <w:b w:val="0"/>
+          <w:i w:val="0"/>
         </w:rPr>
         <w:t>BCA-YOLO bazaviy modelga ~3,1 mln parametr qo'shib, inferens vaqtiga deyarli ta'sir qilmaydi va α=0 da bazaviy modelni aynan tiklaydi.</w:t>
       </w:r>
@@ -20495,6 +22568,7 @@
       <w:r>
         <w:rPr>
           <w:b w:val="0"/>
+          <w:i w:val="0"/>
         </w:rPr>
         <w:t>Nolga initsializatsiyalangan α va monoton ostonalar o'qitish barqarorligini ta'minlaydi.</w:t>
       </w:r>
@@ -20507,6 +22581,7 @@
       <w:r>
         <w:rPr>
           <w:b w:val="0"/>
+          <w:i w:val="0"/>
         </w:rPr>
         <w:t>MAMOGRAF dasturiy majmuasi to'liq klinik ish oqimini qo'llab-quvvatlaydi va lokal ishlash hisobiga maxfiylikni ta'minlaydi.</w:t>
       </w:r>
@@ -20549,6 +22624,7 @@
       <w:r>
         <w:rPr>
           <w:b w:val="0"/>
+          <w:i w:val="0"/>
         </w:rPr>
         <w:t>Mammografiyaning klinik induktiv taxminlarini — ikki tomonlama asimmetriya, ko'rinishlararo muvofiqlik va ordinal BI-RADS baholashni — rasmiy matematik shaklda ifodalovchi BCA-YOLO arxitekturasi taklif etildi.</w:t>
       </w:r>
@@ -20561,6 +22637,7 @@
       <w:r>
         <w:rPr>
           <w:b w:val="0"/>
+          <w:i w:val="0"/>
         </w:rPr>
         <w:t>Ikki tomonlama o'zaro e'tibor (BCA) bloki nolga initsializatsiyalangan o'rganiluvchi α koeffitsiyenti bilan kontralateral asimmetriyani modelga kiritadi va o'rganish boshida bazaviy modelni aynan tiklab, barqaror sozlashni ta'minlaydi; bu xususiyat gradiyent tahlili bilan asoslandi.</w:t>
       </w:r>
@@ -20573,6 +22650,7 @@
       <w:r>
         <w:rPr>
           <w:b w:val="0"/>
+          <w:i w:val="0"/>
         </w:rPr>
         <w:t>Ko'rinishlararo muvofiqlik (IVC) moduli CC va MLO ko'rinishlari o'rtasida obyektlik muvofiqligini ta'minlab, soxta-musbatlarni kamaytiradi.</w:t>
       </w:r>
@@ -20585,6 +22663,7 @@
       <w:r>
         <w:rPr>
           <w:b w:val="0"/>
+          <w:i w:val="0"/>
         </w:rPr>
         <w:t>Ordinal regressiya boshi BI-RADS ni softplus orqali parametrlangan qat'iy monoton ostonalar bilan kumulyativ tarzda baholaydi va yuqori klinik toifalarda baholashni yaxshilaydi.</w:t>
       </w:r>
@@ -20597,6 +22676,7 @@
       <w:r>
         <w:rPr>
           <w:b w:val="0"/>
+          <w:i w:val="0"/>
         </w:rPr>
         <w:t>Radiomik belgilarni chuqur o'rganish bilan birlashtiruvchi gibrid yondashuv izohlanuvchanlikni oshirdi va VinDr-Mammo to'plamida aniqlik 0,904, F1 0,89, mAP 0,78 natijalarini ko'rsatdi.</w:t>
       </w:r>
@@ -20609,6 +22689,7 @@
       <w:r>
         <w:rPr>
           <w:b w:val="0"/>
+          <w:i w:val="0"/>
         </w:rPr>
         <w:t>Annotatsiya, faol o'rganish, AI yordami, GPU'da model o'qitish (Model Studio), avtomatik xulosa va PACS integratsiyasini birlashtirgan MAMOGRAF dasturiy majmuasi yaratildi.</w:t>
       </w:r>
@@ -20621,6 +22702,7 @@
       <w:r>
         <w:rPr>
           <w:b w:val="0"/>
+          <w:i w:val="0"/>
         </w:rPr>
         <w:t>Avtomatik xulosa generatori butunlay lokal (Ollama) ishlaydi, tashqi xizmatga bog'liq emas va grounded — ma'lumot to'qimaydi; natija standart DICOM SR sifatida eksport qilinadi.</w:t>
       </w:r>

</xml_diff>

<commit_message>
Belgilar tavsifidagi xato tuzatildi (LBP va shakl belgilari tushib qolgan edi)
- Haqiqiy tarkib: 8 int + 10 LBP + 6 shape + 12 GLCM + 2 grad = 38
  (maqolalarda "8 gist + 24 GLCM + 6 grad" deb yozilgan edi)
- Jadval-1: sinflar 6->8; rasm o'lchami 640x640/1280x1280 -> 817x1024/1021x1280
- Eski dissertatsiya bobida ham xuddi shu xato + ASM o'rniga "entropiya"
- M1 ning 38 ta raqamli da'vosi JSON bilan tekshirildi: 0 xato

Co-Authored-By: Claude Fable 5 <noreply@anthropic.com>
Claude-Session: https://claude.ai/code/session_019HhRdzBFhtfZkYUpfZ6mRq
</commit_message>
<xml_diff>
--- a/MAMOGRAF_PhD_dissertatsiya.docx
+++ b/MAMOGRAF_PhD_dissertatsiya.docx
@@ -8246,7 +8246,7 @@
           <w:b w:val="0"/>
           <w:i w:val="0"/>
         </w:rPr>
-        <w:t>Har bir ROI kesmasidan 38 ta radiomika belgisi ajratiladi: birinchi tartib statistikalari (o'rtacha, dispersiya, assimetriya, ekstsess), gradient xarakteristikalari (Sobel operatorining o'rtachasi va standart chetlanishi) hamda ikki masofa (d = 1 va d = 3) uchun GLCM belgilari: kontrast, dissimilyarlik, bir jinslilik, energiya, korrelyatsiya, entropiya. Belgilar o'qitish to'plami statistikasi bo'yicha z-normallashtiriladi.</w:t>
+        <w:t>Har bir ROI kesmasidan 38 ta radiomika belgisi ajratiladi: 8 ta intensivlik statistikasi (o'rtacha, standart chetlanish, mediana, assimetriya, ekssess, entropiya va ikkita kvantil), 10 ta lokal binar naqsh (LBP) gistogrammasi komponenti, 6 ta shakl belgisi (yuza nisbati, ekssentrisitet, solidlik, to'ldirish, ixchamlik, tomonlar nisbati), to'rt yo'nalish bo'yicha o'rtachalangan va ikki masofa (d = 1 va d = 3) uchun hisoblangan 12 ta GLCM ko'rsatkichi (kontrast, dissimilyarlik, bir jinslilik, energiya, korrelyatsiya, ASM) hamda 2 ta gradient belgisi (Sobel operatorining o'rtachasi va standart chetlanishi). Belgilar o'qitish to'plami statistikasi bo'yicha z-normallashtiriladi.</w:t>
       </w:r>
     </w:p>
     <w:p>
@@ -16802,7 +16802,7 @@
                 <w:i w:val="0"/>
                 <w:sz w:val="0"/>
               </w:rPr>
-              <w:t>6</w:t>
+              <w:t>8</w:t>
             </w:r>
           </w:p>
         </w:tc>
@@ -16980,7 +16980,7 @@
                 <w:i w:val="0"/>
                 <w:sz w:val="0"/>
               </w:rPr>
-              <w:t>640 × 640</w:t>
+              <w:t>817 × 1024</w:t>
             </w:r>
           </w:p>
         </w:tc>
@@ -16996,7 +16996,7 @@
                 <w:i w:val="0"/>
                 <w:sz w:val="0"/>
               </w:rPr>
-              <w:t>1280 × 1280</w:t>
+              <w:t>1021 × 1280</w:t>
             </w:r>
           </w:p>
         </w:tc>

</xml_diff>